<commit_message>
Economics manuscript: add moral-hazard model of reviewer vigilance (Prop. 8, Table E4), J.P. Morgan gate-and-review practice section with primary sources
Co-Authored-By: Claude Sonnet 5.5 <noreply@anthropic.com>
Claude-Session: https://claude.ai/code/session_01FJoEQKBVMu4pDX4YuJC5vW
</commit_message>
<xml_diff>
--- a/hallucination_poisson/paper/ECON_Manuscript.docx
+++ b/hallucination_poisson/paper/ECON_Manuscript.docx
@@ -62,7 +62,7 @@
           <w:sz w:val="24"/>
           <w:szCs w:val="24"/>
         </w:rPr>
-        <w:t xml:space="preserve">Firms that deploy large language models (LLMs) create a new stochastic cost: errors that humans must absorb. We study the firm's problem of choosing a standby human workforce and a depth of automated screening, which substitute for each other, to minimise expected cost. Standby capacity is a newsvendor quantile of the daily count of human-handled incidents, and a 95% service level is optimal only if an unhandled incident costs twenty times the price of a capacity unit. We show that over-dispersion raises the safety stock beyond what the dispersion index implies, that stacking screens under independence overstates diversification, and that with indivisible capacity and a floor on standing staff the cost of screening depth is not unimodal. We evaluate the model on measured outputs of three small open models passed through three guardrail layers, with simulated arrivals and public traces of LLM services, incidents and tickets. A task-specific verifier cut required capacity by 78 to 95% but rejected 15 to 71% of correct answers, and a routed judge did not demonstrably pay for itself. Ignoring day-to-day variation in demand raised expected cost by 9 to 65% in our examples. Arrivals are simulated, so the numbers illustrate the method.</w:t>
+        <w:t xml:space="preserve">Firms that deploy large language models (LLMs) create a new stochastic cost: errors that humans must absorb. We study the firm's choice of a standby human workforce and a depth of automated screening, which substitute for each other, to minimise expected cost. Standby capacity is a newsvendor quantile of the daily count of human-handled incidents, and a 95% service level is optimal only if an unhandled incident costs twenty times a capacity unit. Over-dispersion raises the safety stock beyond what the dispersion index implies, stacking screens under independence overstates diversification, and, because screening lowers the prevalence of errors that reviewers see, it erodes their vigilance, so handled-incident counts overstate success. We evaluate the model on measured outputs of three small open models through three guardrail layers, with simulated arrivals and public traces. A task-specific verifier cut required capacity by 78 to 95% but rejected 15 to 71% of correct answers, and a routed judge did not demonstrably pay for itself. Ignoring day-to-day variation raised expected cost by 9 to 65%. Arrivals are simulated, so the numbers illustrate the method.</w:t>
       </w:r>
     </w:p>
     <w:p>
@@ -198,7 +198,7 @@
           <w:sz w:val="24"/>
           <w:szCs w:val="24"/>
         </w:rPr>
-        <w:t xml:space="preserve">The contribution is mainly one of application and measurement, and we try to be clear about which results are known. The newsvendor solution and the negative-binomial treatment of over-dispersed demand are classical (Arrow et al. 1951; Porteus 2002; Cameron and Trivedi 1998), as is the Poisson quantile rule for staffing (Whitt 2007). We apply them to a new input, standby labour for machine errors, and add four things. We show how thinning by screening interacts with over-dispersion (Proposition 3). We recast the multiplicative guardrail formula as the independence special case of dependence bounds, and measure the dependence for hallucination-grounding layers (Proposition 4). We show that, with integer capacity and a floor on standing staff, cost is generally not unimodal in the depth of screening, with comparative statics in the ratio of labour to compute prices (Proposition 5). And we replace the single-Poisson description of "all failures" by a typed model in which each class of failure follows the process that matches its mechanism (Proposition 6). Proposition 7 translates the service-level target into the shortfall cost that would rationalise it and quantifies the cost of misspecification.</w:t>
+        <w:t xml:space="preserve">The contribution is mainly one of application and measurement, and we try to be clear about which results are known. The newsvendor solution and the negative-binomial treatment of over-dispersed demand are classical (Arrow et al. 1951; Porteus 2002; Cameron and Trivedi 1998), as is the Poisson quantile rule for staffing (Whitt 2007). We apply them to a new input, standby labour for machine errors, and add four things. We show how thinning by screening interacts with over-dispersion (Proposition 3). We recast the multiplicative guardrail formula as the independence special case of dependence bounds, and measure the dependence for hallucination-grounding layers (Proposition 4). We show that, with integer capacity and a floor on standing staff, cost is generally not unimodal in the depth of screening, with comparative statics in the ratio of labour to compute prices (Proposition 5). And we replace the single-Poisson description of "all failures" by a typed model in which each class of failure follows the process that matches its mechanism (Proposition 6). Proposition 7 translates the service-level target into the shortfall cost that would rationalise it and quantifies the cost of misspecification. Proposition 8 relaxes the assumption that every surviving error is detected: it treats reviewers' attention as a moral-hazard problem in which the screening that removes errors also erodes vigilance, and it shows when gating restores it.</w:t>
       </w:r>
     </w:p>
     <w:p>
@@ -301,7 +301,7 @@
           <w:sz w:val="24"/>
           <w:szCs w:val="24"/>
         </w:rPr>
-        <w:t xml:space="preserve">Berente et al. (2021) argue that AI creates managerial problems that earlier information technologies did not, because of its autonomy, its capacity to learn and its inscrutability. A related stream examines how organisations divide work between people and AI, and describes a tension between automating tasks and augmenting human judgement (Raisch and Krakowski 2021). Human review of AI output is central to both. Yet this work says little about how large the human reserve must be, which is a question of quantities that depend on how errors arrive.</w:t>
+        <w:t xml:space="preserve">Berente et al. (2021) argue that AI creates managerial problems that earlier information technologies did not, because of its autonomy, its capacity to learn and its inscrutability. A related stream examines how organisations divide work between people and AI, and describes a tension between automating tasks and augmenting human judgement (Raisch and Krakowski 2021). Human review of AI output is central to both. Yet this work says little about how large the human reserve must be, which is a question of quantities that depend on how errors arrive. Human-factors research adds that reliance on an automated aid erodes the attention people give to the cases it passes (Parasuraman and Manzey 2010), and economics treats unobservable effort as a moral-hazard problem whose solution is an incentive that depends on what can be observed (Holmström 1979). We bring the two together in Section 3.8.</w:t>
       </w:r>
     </w:p>
     <w:p>
@@ -411,6 +411,41 @@
     </w:p>
     <w:p>
       <w:pPr>
+        <w:pStyle w:val="Heading2"/>
+        <w:keepNext/>
+        <w:spacing w:after="60" w:before="240" w:line="360"/>
+      </w:pPr>
+      <w:r>
+        <w:rPr>
+          <w:rFonts w:ascii="Times New Roman" w:cs="Times New Roman" w:eastAsia="Times New Roman" w:hAnsi="Times New Roman"/>
+          <w:b/>
+          <w:bCs/>
+          <w:i/>
+          <w:iCs/>
+          <w:color w:val="000000"/>
+          <w:sz w:val="24"/>
+          <w:szCs w:val="24"/>
+        </w:rPr>
+        <w:t xml:space="preserve">2.6 Practice: gating and monitoring</w:t>
+      </w:r>
+    </w:p>
+    <w:p>
+      <w:pPr>
+        <w:spacing w:after="0" w:line="480"/>
+        <w:ind w:firstLine="720"/>
+        <w:jc w:val="left"/>
+      </w:pPr>
+      <w:r>
+        <w:rPr>
+          <w:rFonts w:ascii="Times New Roman" w:cs="Times New Roman" w:eastAsia="Times New Roman" w:hAnsi="Times New Roman"/>
+          <w:sz w:val="24"/>
+          <w:szCs w:val="24"/>
+        </w:rPr>
+        <w:t xml:space="preserve">Industry practice already combines automated screening with human review. Researchers at J.P. Morgan propose HalluciBot, a model that estimates a query's propensity to hallucinate before any generation, by perturbing the query, sampling outputs from several agents and running a Monte Carlo simulation to obtain an empirical hallucination rate that supervises an encoder classifier (Watson et al. 2024). Patent-analytics summaries report two filings by the same assignee on pre-generation hallucination probability, which describe using a risk threshold to decide whether a query proceeds to the model or goes to a human expert (PatSnap n.d.); we could not obtain the full texts of those filings and cite them only as reported. A separate J.P. Morgan application describes monitoring model outputs, such as fraud scores, approval decisions and transaction counts, against the same window in earlier days or weeks and alerting an operator when they deviate (US 2024/0330824 A1). We cite these as illustrations of a gate-and-review architecture and of baseline monitoring. None of the documents we read describes hallucinations as a Poisson process or proposes to stop reducing them. They estimate risk, route risky cases to people and watch for drift, which is the structure that Sections 3.7 and 3.8 formalise.</w:t>
+      </w:r>
+    </w:p>
+    <w:p>
+      <w:pPr>
         <w:pStyle w:val="Heading1"/>
         <w:keepNext/>
         <w:spacing w:after="120" w:before="360" w:line="360"/>
@@ -477,7 +512,7 @@
           <w:sz w:val="24"/>
           <w:szCs w:val="24"/>
         </w:rPr>
-        <w:t xml:space="preserve"> and write q ≤ p₀ for the probability that a query produces one. Third, one unit of capacity clears one critical event per day. The first two assumptions put the information problem aside: the firm observes every error that gets through, so the analysis concerns the cost of absorbing errors and not the cost of finding them.</w:t>
+        <w:t xml:space="preserve"> and write q ≤ p₀ for the probability that a query produces one. Third, one unit of capacity clears one critical event per day. The second assumption puts the information problem aside: the firm observes every error that gets through, so Sections 3.1 to 3.7 concern the cost of absorbing errors and not the cost of finding them. Section 3.8 relaxes it by treating the reviewers' attention as a moral-hazard problem.</w:t>
       </w:r>
     </w:p>
     <w:p>
@@ -11532,6 +11567,2525 @@
           <w:szCs w:val="18"/>
         </w:rPr>
         <w:t xml:space="preserve">Poisson counts in both cases. The upper bound is the comonotone case of Proposition 4. Computed by econ_tables.py.</w:t>
+      </w:r>
+    </w:p>
+    <w:p>
+      <w:pPr>
+        <w:pStyle w:val="Heading2"/>
+        <w:keepNext/>
+        <w:spacing w:after="60" w:before="240" w:line="360"/>
+      </w:pPr>
+      <w:r>
+        <w:rPr>
+          <w:rFonts w:ascii="Times New Roman" w:cs="Times New Roman" w:eastAsia="Times New Roman" w:hAnsi="Times New Roman"/>
+          <w:b/>
+          <w:bCs/>
+          <w:i/>
+          <w:iCs/>
+          <w:color w:val="000000"/>
+          <w:sz w:val="24"/>
+          <w:szCs w:val="24"/>
+        </w:rPr>
+        <w:t xml:space="preserve">3.8 Moral hazard in review: screening erodes vigilance</w:t>
+      </w:r>
+    </w:p>
+    <w:p>
+      <w:pPr>
+        <w:spacing w:after="0" w:line="480"/>
+        <w:ind w:firstLine="720"/>
+        <w:jc w:val="left"/>
+      </w:pPr>
+      <w:r>
+        <w:rPr>
+          <w:rFonts w:ascii="Times New Roman" w:cs="Times New Roman" w:eastAsia="Times New Roman" w:hAnsi="Times New Roman"/>
+          <w:sz w:val="24"/>
+          <w:szCs w:val="24"/>
+        </w:rPr>
+        <w:t xml:space="preserve">Sections 3.1 to 3.7 assumed that every error that passes the screens is detected. In practice detection is done by people whose attention the firm cannot observe, and whose incentive to attend depends on how often attention pays. Suppose a reviewer inspects M items per day, of which a share ρ = λ_N/M are critical hallucinations. On each item the reviewer chooses attention e ∈ [0, 1] at a private cost ψe²/2 and finds an error, if there is one, with probability e. The reviewer is rewarded r, in money or in reputation, for each error found. The firm observes neither e nor the errors that are missed, which is the standard setting of moral hazard (Holmström 1979).</w:t>
+      </w:r>
+    </w:p>
+    <w:p>
+      <w:pPr>
+        <w:pBdr>
+          <w:left w:val="single" w:color="888888" w:sz="12" w:space="8"/>
+        </w:pBdr>
+        <w:spacing w:after="160" w:before="120" w:line="360"/>
+        <w:ind w:left="360" w:right="360"/>
+        <w:jc w:val="left"/>
+      </w:pPr>
+      <w:r>
+        <w:rPr>
+          <w:rFonts w:ascii="Times New Roman" w:cs="Times New Roman" w:eastAsia="Times New Roman" w:hAnsi="Times New Roman"/>
+          <w:b/>
+          <w:bCs/>
+          <w:sz w:val="24"/>
+          <w:szCs w:val="24"/>
+        </w:rPr>
+        <w:t xml:space="preserve">Proposition 8 (vigilance under screening and gating). </w:t>
+      </w:r>
+      <w:r>
+        <w:rPr>
+          <w:rFonts w:ascii="Times New Roman" w:cs="Times New Roman" w:eastAsia="Times New Roman" w:hAnsi="Times New Roman"/>
+          <w:sz w:val="24"/>
+          <w:szCs w:val="24"/>
+        </w:rPr>
+        <w:t xml:space="preserve">(a) The reviewer's optimal attention is e</w:t>
+      </w:r>
+      <w:r>
+        <w:rPr>
+          <w:rFonts w:ascii="Times New Roman" w:cs="Times New Roman" w:eastAsia="Times New Roman" w:hAnsi="Times New Roman"/>
+          <w:i/>
+          <w:iCs/>
+          <w:sz w:val="24"/>
+          <w:szCs w:val="24"/>
+        </w:rPr>
+        <w:t xml:space="preserve"> = min{1, rρ/ψ}. (b) For a fixed reward r, e</w:t>
+      </w:r>
+      <w:r>
+        <w:rPr>
+          <w:rFonts w:ascii="Times New Roman" w:cs="Times New Roman" w:eastAsia="Times New Roman" w:hAnsi="Times New Roman"/>
+          <w:sz w:val="24"/>
+          <w:szCs w:val="24"/>
+        </w:rPr>
+        <w:t xml:space="preserve"> is non-decreasing in the prevalence ρ. Adding screening layers lowers ρ and therefore weakly lowers detection, and in the interior region the number of errors found, e*λ_N = rλ_N²/(ψM), falls with the square of the residual rate. (c) Holding attention at e = 1 requires r ≥ ψ/ρ, a reward that rises in inverse proportion to prevalence, while the expected payment at full attention, rρM = ψM, does not depend on screening depth. (d) Consider a gate that sends a fraction γ of items to review and contains a share s of the critical hallucinations. It raises prevalence in the reviewed set to sρ/γ and, when attention is interior with and without the gate, raises the expected number of errors found if and only if s² &gt; γ.</w:t>
+      </w:r>
+    </w:p>
+    <w:p>
+      <w:pPr>
+        <w:spacing w:after="0" w:line="480"/>
+        <w:ind w:firstLine="720"/>
+        <w:jc w:val="left"/>
+      </w:pPr>
+      <w:r>
+        <w:rPr>
+          <w:rFonts w:ascii="Times New Roman" w:cs="Times New Roman" w:eastAsia="Times New Roman" w:hAnsi="Times New Roman"/>
+          <w:sz w:val="24"/>
+          <w:szCs w:val="24"/>
+        </w:rPr>
+        <w:t xml:space="preserve">Part (b) is the vigilance problem in economic form. Screening and attention are substitutes in effect: the better the automated layers, the rarer an error is among the items a person sees, and the less a reviewer gains from looking hard. The number of events handled, which is the figure a planner observes, then falls faster than the number of errors that survive. Table E4 illustrates this with the cascade of Table 3 scaled to λ₀ = 100 errors per day among 1,000 reviewed items, a reward of $7.50 per error found and an effort-cost scale of $0.30 per item. Without screening, prevalence is 10% and reviewers attend fully. With three layers the residual rate is 5.1 per day, prevalence 0.51% and attention 0.13, so the team handles 0.64 events per day while 4.4 errors a day go undetected. A capacity plan that assumes full detection holds 9 units, although 2 would be used, and an operations dashboard that counts handled incidents would show a fall of 99.4% from the unscreened level, against a true fall of 94.9% in surviving errors. The metric that planners watch therefore overstates the success of screening, and the approach of maintaining the status quo while watching incident counts hides the loss of detection.</w:t>
+      </w:r>
+    </w:p>
+    <w:p>
+      <w:pPr>
+        <w:keepNext/>
+        <w:spacing w:after="80" w:before="240" w:line="276"/>
+      </w:pPr>
+      <w:r>
+        <w:rPr>
+          <w:rFonts w:ascii="Times New Roman" w:cs="Times New Roman" w:eastAsia="Times New Roman" w:hAnsi="Times New Roman"/>
+          <w:b/>
+          <w:bCs/>
+          <w:sz w:val="22"/>
+          <w:szCs w:val="22"/>
+        </w:rPr>
+        <w:t xml:space="preserve">Table E4. Reviewer attention and detection by screening depth (λ₀ = 100, clearance 0.63 per layer, M = 1,000 items per day, reward r = $7.50, ψ = $0.30, harm $100 per undetected error, C_h = $150, α = 0.95)</w:t>
+      </w:r>
+    </w:p>
+    <w:tbl>
+      <w:tblPr>
+        <w:tblW w:type="dxa" w:w="9560"/>
+        <w:tblBorders>
+          <w:top w:val="single" w:color="auto" w:sz="4"/>
+          <w:left w:val="single" w:color="auto" w:sz="4"/>
+          <w:bottom w:val="single" w:color="auto" w:sz="4"/>
+          <w:right w:val="single" w:color="auto" w:sz="4"/>
+          <w:insideH w:val="single" w:color="auto" w:sz="4"/>
+          <w:insideV w:val="single" w:color="auto" w:sz="4"/>
+        </w:tblBorders>
+      </w:tblPr>
+      <w:tblGrid>
+        <w:gridCol w:w="500"/>
+        <w:gridCol w:w="1100"/>
+        <w:gridCol w:w="1100"/>
+        <w:gridCol w:w="1100"/>
+        <w:gridCol w:w="1100"/>
+        <w:gridCol w:w="1200"/>
+        <w:gridCol w:w="1200"/>
+        <w:gridCol w:w="1100"/>
+        <w:gridCol w:w="1160"/>
+      </w:tblGrid>
+      <w:tr>
+        <w:trPr>
+          <w:tblHeader/>
+        </w:trPr>
+        <w:tc>
+          <w:tcPr>
+            <w:tcW w:type="dxa" w:w="500"/>
+            <w:tcBorders>
+              <w:top w:val="single" w:color="AAAAAA" w:sz="4"/>
+              <w:left w:val="single" w:color="AAAAAA" w:sz="4"/>
+              <w:bottom w:val="single" w:color="AAAAAA" w:sz="4"/>
+              <w:right w:val="single" w:color="AAAAAA" w:sz="4"/>
+            </w:tcBorders>
+            <w:shd w:fill="E8E8E8" w:color="auto" w:val="clear"/>
+            <w:tcMar>
+              <w:top w:type="dxa" w:w="40"/>
+              <w:left w:type="dxa" w:w="80"/>
+              <w:bottom w:type="dxa" w:w="40"/>
+              <w:right w:type="dxa" w:w="80"/>
+            </w:tcMar>
+          </w:tcPr>
+          <w:p>
+            <w:pPr>
+              <w:jc w:val="center"/>
+            </w:pPr>
+            <w:r>
+              <w:rPr>
+                <w:rFonts w:ascii="Times New Roman" w:cs="Times New Roman" w:eastAsia="Times New Roman" w:hAnsi="Times New Roman"/>
+                <w:b/>
+                <w:bCs/>
+                <w:sz w:val="18"/>
+                <w:szCs w:val="18"/>
+              </w:rPr>
+              <w:t xml:space="preserve">N</w:t>
+            </w:r>
+          </w:p>
+        </w:tc>
+        <w:tc>
+          <w:tcPr>
+            <w:tcW w:type="dxa" w:w="1100"/>
+            <w:tcBorders>
+              <w:top w:val="single" w:color="AAAAAA" w:sz="4"/>
+              <w:left w:val="single" w:color="AAAAAA" w:sz="4"/>
+              <w:bottom w:val="single" w:color="AAAAAA" w:sz="4"/>
+              <w:right w:val="single" w:color="AAAAAA" w:sz="4"/>
+            </w:tcBorders>
+            <w:shd w:fill="E8E8E8" w:color="auto" w:val="clear"/>
+            <w:tcMar>
+              <w:top w:type="dxa" w:w="40"/>
+              <w:left w:type="dxa" w:w="80"/>
+              <w:bottom w:type="dxa" w:w="40"/>
+              <w:right w:type="dxa" w:w="80"/>
+            </w:tcMar>
+          </w:tcPr>
+          <w:p>
+            <w:pPr>
+              <w:jc w:val="center"/>
+            </w:pPr>
+            <w:r>
+              <w:rPr>
+                <w:rFonts w:ascii="Times New Roman" w:cs="Times New Roman" w:eastAsia="Times New Roman" w:hAnsi="Times New Roman"/>
+                <w:b/>
+                <w:bCs/>
+                <w:sz w:val="18"/>
+                <w:szCs w:val="18"/>
+              </w:rPr>
+              <w:t xml:space="preserve">Residual rate λ_N</w:t>
+            </w:r>
+          </w:p>
+        </w:tc>
+        <w:tc>
+          <w:tcPr>
+            <w:tcW w:type="dxa" w:w="1100"/>
+            <w:tcBorders>
+              <w:top w:val="single" w:color="AAAAAA" w:sz="4"/>
+              <w:left w:val="single" w:color="AAAAAA" w:sz="4"/>
+              <w:bottom w:val="single" w:color="AAAAAA" w:sz="4"/>
+              <w:right w:val="single" w:color="AAAAAA" w:sz="4"/>
+            </w:tcBorders>
+            <w:shd w:fill="E8E8E8" w:color="auto" w:val="clear"/>
+            <w:tcMar>
+              <w:top w:type="dxa" w:w="40"/>
+              <w:left w:type="dxa" w:w="80"/>
+              <w:bottom w:type="dxa" w:w="40"/>
+              <w:right w:type="dxa" w:w="80"/>
+            </w:tcMar>
+          </w:tcPr>
+          <w:p>
+            <w:pPr>
+              <w:jc w:val="center"/>
+            </w:pPr>
+            <w:r>
+              <w:rPr>
+                <w:rFonts w:ascii="Times New Roman" w:cs="Times New Roman" w:eastAsia="Times New Roman" w:hAnsi="Times New Roman"/>
+                <w:b/>
+                <w:bCs/>
+                <w:sz w:val="18"/>
+                <w:szCs w:val="18"/>
+              </w:rPr>
+              <w:t xml:space="preserve">Prevalence ρ</w:t>
+            </w:r>
+          </w:p>
+        </w:tc>
+        <w:tc>
+          <w:tcPr>
+            <w:tcW w:type="dxa" w:w="1100"/>
+            <w:tcBorders>
+              <w:top w:val="single" w:color="AAAAAA" w:sz="4"/>
+              <w:left w:val="single" w:color="AAAAAA" w:sz="4"/>
+              <w:bottom w:val="single" w:color="AAAAAA" w:sz="4"/>
+              <w:right w:val="single" w:color="AAAAAA" w:sz="4"/>
+            </w:tcBorders>
+            <w:shd w:fill="E8E8E8" w:color="auto" w:val="clear"/>
+            <w:tcMar>
+              <w:top w:type="dxa" w:w="40"/>
+              <w:left w:type="dxa" w:w="80"/>
+              <w:bottom w:type="dxa" w:w="40"/>
+              <w:right w:type="dxa" w:w="80"/>
+            </w:tcMar>
+          </w:tcPr>
+          <w:p>
+            <w:pPr>
+              <w:jc w:val="center"/>
+            </w:pPr>
+            <w:r>
+              <w:rPr>
+                <w:rFonts w:ascii="Times New Roman" w:cs="Times New Roman" w:eastAsia="Times New Roman" w:hAnsi="Times New Roman"/>
+                <w:b/>
+                <w:bCs/>
+                <w:sz w:val="18"/>
+                <w:szCs w:val="18"/>
+              </w:rPr>
+              <w:t xml:space="preserve">Attention e*</w:t>
+            </w:r>
+          </w:p>
+        </w:tc>
+        <w:tc>
+          <w:tcPr>
+            <w:tcW w:type="dxa" w:w="1100"/>
+            <w:tcBorders>
+              <w:top w:val="single" w:color="AAAAAA" w:sz="4"/>
+              <w:left w:val="single" w:color="AAAAAA" w:sz="4"/>
+              <w:bottom w:val="single" w:color="AAAAAA" w:sz="4"/>
+              <w:right w:val="single" w:color="AAAAAA" w:sz="4"/>
+            </w:tcBorders>
+            <w:shd w:fill="E8E8E8" w:color="auto" w:val="clear"/>
+            <w:tcMar>
+              <w:top w:type="dxa" w:w="40"/>
+              <w:left w:type="dxa" w:w="80"/>
+              <w:bottom w:type="dxa" w:w="40"/>
+              <w:right w:type="dxa" w:w="80"/>
+            </w:tcMar>
+          </w:tcPr>
+          <w:p>
+            <w:pPr>
+              <w:jc w:val="center"/>
+            </w:pPr>
+            <w:r>
+              <w:rPr>
+                <w:rFonts w:ascii="Times New Roman" w:cs="Times New Roman" w:eastAsia="Times New Roman" w:hAnsi="Times New Roman"/>
+                <w:b/>
+                <w:bCs/>
+                <w:sz w:val="18"/>
+                <w:szCs w:val="18"/>
+              </w:rPr>
+              <w:t xml:space="preserve">Events handled</w:t>
+            </w:r>
+          </w:p>
+        </w:tc>
+        <w:tc>
+          <w:tcPr>
+            <w:tcW w:type="dxa" w:w="1200"/>
+            <w:tcBorders>
+              <w:top w:val="single" w:color="AAAAAA" w:sz="4"/>
+              <w:left w:val="single" w:color="AAAAAA" w:sz="4"/>
+              <w:bottom w:val="single" w:color="AAAAAA" w:sz="4"/>
+              <w:right w:val="single" w:color="AAAAAA" w:sz="4"/>
+            </w:tcBorders>
+            <w:shd w:fill="E8E8E8" w:color="auto" w:val="clear"/>
+            <w:tcMar>
+              <w:top w:type="dxa" w:w="40"/>
+              <w:left w:type="dxa" w:w="80"/>
+              <w:bottom w:type="dxa" w:w="40"/>
+              <w:right w:type="dxa" w:w="80"/>
+            </w:tcMar>
+          </w:tcPr>
+          <w:p>
+            <w:pPr>
+              <w:jc w:val="center"/>
+            </w:pPr>
+            <w:r>
+              <w:rPr>
+                <w:rFonts w:ascii="Times New Roman" w:cs="Times New Roman" w:eastAsia="Times New Roman" w:hAnsi="Times New Roman"/>
+                <w:b/>
+                <w:bCs/>
+                <w:sz w:val="18"/>
+                <w:szCs w:val="18"/>
+              </w:rPr>
+              <w:t xml:space="preserve">Undetected errors</w:t>
+            </w:r>
+          </w:p>
+        </w:tc>
+        <w:tc>
+          <w:tcPr>
+            <w:tcW w:type="dxa" w:w="1200"/>
+            <w:tcBorders>
+              <w:top w:val="single" w:color="AAAAAA" w:sz="4"/>
+              <w:left w:val="single" w:color="AAAAAA" w:sz="4"/>
+              <w:bottom w:val="single" w:color="AAAAAA" w:sz="4"/>
+              <w:right w:val="single" w:color="AAAAAA" w:sz="4"/>
+            </w:tcBorders>
+            <w:shd w:fill="E8E8E8" w:color="auto" w:val="clear"/>
+            <w:tcMar>
+              <w:top w:type="dxa" w:w="40"/>
+              <w:left w:type="dxa" w:w="80"/>
+              <w:bottom w:type="dxa" w:w="40"/>
+              <w:right w:type="dxa" w:w="80"/>
+            </w:tcMar>
+          </w:tcPr>
+          <w:p>
+            <w:pPr>
+              <w:jc w:val="center"/>
+            </w:pPr>
+            <w:r>
+              <w:rPr>
+                <w:rFonts w:ascii="Times New Roman" w:cs="Times New Roman" w:eastAsia="Times New Roman" w:hAnsi="Times New Roman"/>
+                <w:b/>
+                <w:bCs/>
+                <w:sz w:val="18"/>
+                <w:szCs w:val="18"/>
+              </w:rPr>
+              <w:t xml:space="preserve">k planned (full detection)</w:t>
+            </w:r>
+          </w:p>
+        </w:tc>
+        <w:tc>
+          <w:tcPr>
+            <w:tcW w:type="dxa" w:w="1100"/>
+            <w:tcBorders>
+              <w:top w:val="single" w:color="AAAAAA" w:sz="4"/>
+              <w:left w:val="single" w:color="AAAAAA" w:sz="4"/>
+              <w:bottom w:val="single" w:color="AAAAAA" w:sz="4"/>
+              <w:right w:val="single" w:color="AAAAAA" w:sz="4"/>
+            </w:tcBorders>
+            <w:shd w:fill="E8E8E8" w:color="auto" w:val="clear"/>
+            <w:tcMar>
+              <w:top w:type="dxa" w:w="40"/>
+              <w:left w:type="dxa" w:w="80"/>
+              <w:bottom w:type="dxa" w:w="40"/>
+              <w:right w:type="dxa" w:w="80"/>
+            </w:tcMar>
+          </w:tcPr>
+          <w:p>
+            <w:pPr>
+              <w:jc w:val="center"/>
+            </w:pPr>
+            <w:r>
+              <w:rPr>
+                <w:rFonts w:ascii="Times New Roman" w:cs="Times New Roman" w:eastAsia="Times New Roman" w:hAnsi="Times New Roman"/>
+                <w:b/>
+                <w:bCs/>
+                <w:sz w:val="18"/>
+                <w:szCs w:val="18"/>
+              </w:rPr>
+              <w:t xml:space="preserve">k actually needed</w:t>
+            </w:r>
+          </w:p>
+        </w:tc>
+        <w:tc>
+          <w:tcPr>
+            <w:tcW w:type="dxa" w:w="1160"/>
+            <w:tcBorders>
+              <w:top w:val="single" w:color="AAAAAA" w:sz="4"/>
+              <w:left w:val="single" w:color="AAAAAA" w:sz="4"/>
+              <w:bottom w:val="single" w:color="AAAAAA" w:sz="4"/>
+              <w:right w:val="single" w:color="AAAAAA" w:sz="4"/>
+            </w:tcBorders>
+            <w:shd w:fill="E8E8E8" w:color="auto" w:val="clear"/>
+            <w:tcMar>
+              <w:top w:type="dxa" w:w="40"/>
+              <w:left w:type="dxa" w:w="80"/>
+              <w:bottom w:type="dxa" w:w="40"/>
+              <w:right w:type="dxa" w:w="80"/>
+            </w:tcMar>
+          </w:tcPr>
+          <w:p>
+            <w:pPr>
+              <w:jc w:val="center"/>
+            </w:pPr>
+            <w:r>
+              <w:rPr>
+                <w:rFonts w:ascii="Times New Roman" w:cs="Times New Roman" w:eastAsia="Times New Roman" w:hAnsi="Times New Roman"/>
+                <w:b/>
+                <w:bCs/>
+                <w:sz w:val="18"/>
+                <w:szCs w:val="18"/>
+              </w:rPr>
+              <w:t xml:space="preserve">Reward for full attention</w:t>
+            </w:r>
+          </w:p>
+        </w:tc>
+      </w:tr>
+      <w:tr>
+        <w:trPr>
+          <w:cantSplit/>
+        </w:trPr>
+        <w:tc>
+          <w:tcPr>
+            <w:tcW w:type="dxa" w:w="500"/>
+            <w:tcBorders>
+              <w:top w:val="single" w:color="AAAAAA" w:sz="4"/>
+              <w:left w:val="single" w:color="AAAAAA" w:sz="4"/>
+              <w:bottom w:val="single" w:color="AAAAAA" w:sz="4"/>
+              <w:right w:val="single" w:color="AAAAAA" w:sz="4"/>
+            </w:tcBorders>
+            <w:tcMar>
+              <w:top w:type="dxa" w:w="40"/>
+              <w:left w:type="dxa" w:w="80"/>
+              <w:bottom w:type="dxa" w:w="40"/>
+              <w:right w:type="dxa" w:w="80"/>
+            </w:tcMar>
+          </w:tcPr>
+          <w:p>
+            <w:pPr>
+              <w:jc w:val="center"/>
+            </w:pPr>
+            <w:r>
+              <w:rPr>
+                <w:rFonts w:ascii="Times New Roman" w:cs="Times New Roman" w:eastAsia="Times New Roman" w:hAnsi="Times New Roman"/>
+                <w:b w:val="false"/>
+                <w:bCs w:val="false"/>
+                <w:sz w:val="18"/>
+                <w:szCs w:val="18"/>
+              </w:rPr>
+              <w:t xml:space="preserve">0</w:t>
+            </w:r>
+          </w:p>
+        </w:tc>
+        <w:tc>
+          <w:tcPr>
+            <w:tcW w:type="dxa" w:w="1100"/>
+            <w:tcBorders>
+              <w:top w:val="single" w:color="AAAAAA" w:sz="4"/>
+              <w:left w:val="single" w:color="AAAAAA" w:sz="4"/>
+              <w:bottom w:val="single" w:color="AAAAAA" w:sz="4"/>
+              <w:right w:val="single" w:color="AAAAAA" w:sz="4"/>
+            </w:tcBorders>
+            <w:tcMar>
+              <w:top w:type="dxa" w:w="40"/>
+              <w:left w:type="dxa" w:w="80"/>
+              <w:bottom w:type="dxa" w:w="40"/>
+              <w:right w:type="dxa" w:w="80"/>
+            </w:tcMar>
+          </w:tcPr>
+          <w:p>
+            <w:pPr>
+              <w:jc w:val="center"/>
+            </w:pPr>
+            <w:r>
+              <w:rPr>
+                <w:rFonts w:ascii="Times New Roman" w:cs="Times New Roman" w:eastAsia="Times New Roman" w:hAnsi="Times New Roman"/>
+                <w:b w:val="false"/>
+                <w:bCs w:val="false"/>
+                <w:sz w:val="18"/>
+                <w:szCs w:val="18"/>
+              </w:rPr>
+              <w:t xml:space="preserve">100.0</w:t>
+            </w:r>
+          </w:p>
+        </w:tc>
+        <w:tc>
+          <w:tcPr>
+            <w:tcW w:type="dxa" w:w="1100"/>
+            <w:tcBorders>
+              <w:top w:val="single" w:color="AAAAAA" w:sz="4"/>
+              <w:left w:val="single" w:color="AAAAAA" w:sz="4"/>
+              <w:bottom w:val="single" w:color="AAAAAA" w:sz="4"/>
+              <w:right w:val="single" w:color="AAAAAA" w:sz="4"/>
+            </w:tcBorders>
+            <w:tcMar>
+              <w:top w:type="dxa" w:w="40"/>
+              <w:left w:type="dxa" w:w="80"/>
+              <w:bottom w:type="dxa" w:w="40"/>
+              <w:right w:type="dxa" w:w="80"/>
+            </w:tcMar>
+          </w:tcPr>
+          <w:p>
+            <w:pPr>
+              <w:jc w:val="center"/>
+            </w:pPr>
+            <w:r>
+              <w:rPr>
+                <w:rFonts w:ascii="Times New Roman" w:cs="Times New Roman" w:eastAsia="Times New Roman" w:hAnsi="Times New Roman"/>
+                <w:b w:val="false"/>
+                <w:bCs w:val="false"/>
+                <w:sz w:val="18"/>
+                <w:szCs w:val="18"/>
+              </w:rPr>
+              <w:t xml:space="preserve">10.00%</w:t>
+            </w:r>
+          </w:p>
+        </w:tc>
+        <w:tc>
+          <w:tcPr>
+            <w:tcW w:type="dxa" w:w="1100"/>
+            <w:tcBorders>
+              <w:top w:val="single" w:color="AAAAAA" w:sz="4"/>
+              <w:left w:val="single" w:color="AAAAAA" w:sz="4"/>
+              <w:bottom w:val="single" w:color="AAAAAA" w:sz="4"/>
+              <w:right w:val="single" w:color="AAAAAA" w:sz="4"/>
+            </w:tcBorders>
+            <w:tcMar>
+              <w:top w:type="dxa" w:w="40"/>
+              <w:left w:type="dxa" w:w="80"/>
+              <w:bottom w:type="dxa" w:w="40"/>
+              <w:right w:type="dxa" w:w="80"/>
+            </w:tcMar>
+          </w:tcPr>
+          <w:p>
+            <w:pPr>
+              <w:jc w:val="center"/>
+            </w:pPr>
+            <w:r>
+              <w:rPr>
+                <w:rFonts w:ascii="Times New Roman" w:cs="Times New Roman" w:eastAsia="Times New Roman" w:hAnsi="Times New Roman"/>
+                <w:b w:val="false"/>
+                <w:bCs w:val="false"/>
+                <w:sz w:val="18"/>
+                <w:szCs w:val="18"/>
+              </w:rPr>
+              <w:t xml:space="preserve">1.00</w:t>
+            </w:r>
+          </w:p>
+        </w:tc>
+        <w:tc>
+          <w:tcPr>
+            <w:tcW w:type="dxa" w:w="1100"/>
+            <w:tcBorders>
+              <w:top w:val="single" w:color="AAAAAA" w:sz="4"/>
+              <w:left w:val="single" w:color="AAAAAA" w:sz="4"/>
+              <w:bottom w:val="single" w:color="AAAAAA" w:sz="4"/>
+              <w:right w:val="single" w:color="AAAAAA" w:sz="4"/>
+            </w:tcBorders>
+            <w:tcMar>
+              <w:top w:type="dxa" w:w="40"/>
+              <w:left w:type="dxa" w:w="80"/>
+              <w:bottom w:type="dxa" w:w="40"/>
+              <w:right w:type="dxa" w:w="80"/>
+            </w:tcMar>
+          </w:tcPr>
+          <w:p>
+            <w:pPr>
+              <w:jc w:val="center"/>
+            </w:pPr>
+            <w:r>
+              <w:rPr>
+                <w:rFonts w:ascii="Times New Roman" w:cs="Times New Roman" w:eastAsia="Times New Roman" w:hAnsi="Times New Roman"/>
+                <w:b w:val="false"/>
+                <w:bCs w:val="false"/>
+                <w:sz w:val="18"/>
+                <w:szCs w:val="18"/>
+              </w:rPr>
+              <w:t xml:space="preserve">100.00</w:t>
+            </w:r>
+          </w:p>
+        </w:tc>
+        <w:tc>
+          <w:tcPr>
+            <w:tcW w:type="dxa" w:w="1200"/>
+            <w:tcBorders>
+              <w:top w:val="single" w:color="AAAAAA" w:sz="4"/>
+              <w:left w:val="single" w:color="AAAAAA" w:sz="4"/>
+              <w:bottom w:val="single" w:color="AAAAAA" w:sz="4"/>
+              <w:right w:val="single" w:color="AAAAAA" w:sz="4"/>
+            </w:tcBorders>
+            <w:tcMar>
+              <w:top w:type="dxa" w:w="40"/>
+              <w:left w:type="dxa" w:w="80"/>
+              <w:bottom w:type="dxa" w:w="40"/>
+              <w:right w:type="dxa" w:w="80"/>
+            </w:tcMar>
+          </w:tcPr>
+          <w:p>
+            <w:pPr>
+              <w:jc w:val="center"/>
+            </w:pPr>
+            <w:r>
+              <w:rPr>
+                <w:rFonts w:ascii="Times New Roman" w:cs="Times New Roman" w:eastAsia="Times New Roman" w:hAnsi="Times New Roman"/>
+                <w:b w:val="false"/>
+                <w:bCs w:val="false"/>
+                <w:sz w:val="18"/>
+                <w:szCs w:val="18"/>
+              </w:rPr>
+              <w:t xml:space="preserve">0.0</w:t>
+            </w:r>
+          </w:p>
+        </w:tc>
+        <w:tc>
+          <w:tcPr>
+            <w:tcW w:type="dxa" w:w="1200"/>
+            <w:tcBorders>
+              <w:top w:val="single" w:color="AAAAAA" w:sz="4"/>
+              <w:left w:val="single" w:color="AAAAAA" w:sz="4"/>
+              <w:bottom w:val="single" w:color="AAAAAA" w:sz="4"/>
+              <w:right w:val="single" w:color="AAAAAA" w:sz="4"/>
+            </w:tcBorders>
+            <w:tcMar>
+              <w:top w:type="dxa" w:w="40"/>
+              <w:left w:type="dxa" w:w="80"/>
+              <w:bottom w:type="dxa" w:w="40"/>
+              <w:right w:type="dxa" w:w="80"/>
+            </w:tcMar>
+          </w:tcPr>
+          <w:p>
+            <w:pPr>
+              <w:jc w:val="center"/>
+            </w:pPr>
+            <w:r>
+              <w:rPr>
+                <w:rFonts w:ascii="Times New Roman" w:cs="Times New Roman" w:eastAsia="Times New Roman" w:hAnsi="Times New Roman"/>
+                <w:b w:val="false"/>
+                <w:bCs w:val="false"/>
+                <w:sz w:val="18"/>
+                <w:szCs w:val="18"/>
+              </w:rPr>
+              <w:t xml:space="preserve">117</w:t>
+            </w:r>
+          </w:p>
+        </w:tc>
+        <w:tc>
+          <w:tcPr>
+            <w:tcW w:type="dxa" w:w="1100"/>
+            <w:tcBorders>
+              <w:top w:val="single" w:color="AAAAAA" w:sz="4"/>
+              <w:left w:val="single" w:color="AAAAAA" w:sz="4"/>
+              <w:bottom w:val="single" w:color="AAAAAA" w:sz="4"/>
+              <w:right w:val="single" w:color="AAAAAA" w:sz="4"/>
+            </w:tcBorders>
+            <w:tcMar>
+              <w:top w:type="dxa" w:w="40"/>
+              <w:left w:type="dxa" w:w="80"/>
+              <w:bottom w:type="dxa" w:w="40"/>
+              <w:right w:type="dxa" w:w="80"/>
+            </w:tcMar>
+          </w:tcPr>
+          <w:p>
+            <w:pPr>
+              <w:jc w:val="center"/>
+            </w:pPr>
+            <w:r>
+              <w:rPr>
+                <w:rFonts w:ascii="Times New Roman" w:cs="Times New Roman" w:eastAsia="Times New Roman" w:hAnsi="Times New Roman"/>
+                <w:b w:val="false"/>
+                <w:bCs w:val="false"/>
+                <w:sz w:val="18"/>
+                <w:szCs w:val="18"/>
+              </w:rPr>
+              <w:t xml:space="preserve">117</w:t>
+            </w:r>
+          </w:p>
+        </w:tc>
+        <w:tc>
+          <w:tcPr>
+            <w:tcW w:type="dxa" w:w="1160"/>
+            <w:tcBorders>
+              <w:top w:val="single" w:color="AAAAAA" w:sz="4"/>
+              <w:left w:val="single" w:color="AAAAAA" w:sz="4"/>
+              <w:bottom w:val="single" w:color="AAAAAA" w:sz="4"/>
+              <w:right w:val="single" w:color="AAAAAA" w:sz="4"/>
+            </w:tcBorders>
+            <w:tcMar>
+              <w:top w:type="dxa" w:w="40"/>
+              <w:left w:type="dxa" w:w="80"/>
+              <w:bottom w:type="dxa" w:w="40"/>
+              <w:right w:type="dxa" w:w="80"/>
+            </w:tcMar>
+          </w:tcPr>
+          <w:p>
+            <w:pPr>
+              <w:jc w:val="center"/>
+            </w:pPr>
+            <w:r>
+              <w:rPr>
+                <w:rFonts w:ascii="Times New Roman" w:cs="Times New Roman" w:eastAsia="Times New Roman" w:hAnsi="Times New Roman"/>
+                <w:b w:val="false"/>
+                <w:bCs w:val="false"/>
+                <w:sz w:val="18"/>
+                <w:szCs w:val="18"/>
+              </w:rPr>
+              <w:t xml:space="preserve">$3.0</w:t>
+            </w:r>
+          </w:p>
+        </w:tc>
+      </w:tr>
+      <w:tr>
+        <w:trPr>
+          <w:cantSplit/>
+        </w:trPr>
+        <w:tc>
+          <w:tcPr>
+            <w:tcW w:type="dxa" w:w="500"/>
+            <w:tcBorders>
+              <w:top w:val="single" w:color="AAAAAA" w:sz="4"/>
+              <w:left w:val="single" w:color="AAAAAA" w:sz="4"/>
+              <w:bottom w:val="single" w:color="AAAAAA" w:sz="4"/>
+              <w:right w:val="single" w:color="AAAAAA" w:sz="4"/>
+            </w:tcBorders>
+            <w:tcMar>
+              <w:top w:type="dxa" w:w="40"/>
+              <w:left w:type="dxa" w:w="80"/>
+              <w:bottom w:type="dxa" w:w="40"/>
+              <w:right w:type="dxa" w:w="80"/>
+            </w:tcMar>
+          </w:tcPr>
+          <w:p>
+            <w:pPr>
+              <w:jc w:val="center"/>
+            </w:pPr>
+            <w:r>
+              <w:rPr>
+                <w:rFonts w:ascii="Times New Roman" w:cs="Times New Roman" w:eastAsia="Times New Roman" w:hAnsi="Times New Roman"/>
+                <w:b w:val="false"/>
+                <w:bCs w:val="false"/>
+                <w:sz w:val="18"/>
+                <w:szCs w:val="18"/>
+              </w:rPr>
+              <w:t xml:space="preserve">1</w:t>
+            </w:r>
+          </w:p>
+        </w:tc>
+        <w:tc>
+          <w:tcPr>
+            <w:tcW w:type="dxa" w:w="1100"/>
+            <w:tcBorders>
+              <w:top w:val="single" w:color="AAAAAA" w:sz="4"/>
+              <w:left w:val="single" w:color="AAAAAA" w:sz="4"/>
+              <w:bottom w:val="single" w:color="AAAAAA" w:sz="4"/>
+              <w:right w:val="single" w:color="AAAAAA" w:sz="4"/>
+            </w:tcBorders>
+            <w:tcMar>
+              <w:top w:type="dxa" w:w="40"/>
+              <w:left w:type="dxa" w:w="80"/>
+              <w:bottom w:type="dxa" w:w="40"/>
+              <w:right w:type="dxa" w:w="80"/>
+            </w:tcMar>
+          </w:tcPr>
+          <w:p>
+            <w:pPr>
+              <w:jc w:val="center"/>
+            </w:pPr>
+            <w:r>
+              <w:rPr>
+                <w:rFonts w:ascii="Times New Roman" w:cs="Times New Roman" w:eastAsia="Times New Roman" w:hAnsi="Times New Roman"/>
+                <w:b w:val="false"/>
+                <w:bCs w:val="false"/>
+                <w:sz w:val="18"/>
+                <w:szCs w:val="18"/>
+              </w:rPr>
+              <w:t xml:space="preserve">37.0</w:t>
+            </w:r>
+          </w:p>
+        </w:tc>
+        <w:tc>
+          <w:tcPr>
+            <w:tcW w:type="dxa" w:w="1100"/>
+            <w:tcBorders>
+              <w:top w:val="single" w:color="AAAAAA" w:sz="4"/>
+              <w:left w:val="single" w:color="AAAAAA" w:sz="4"/>
+              <w:bottom w:val="single" w:color="AAAAAA" w:sz="4"/>
+              <w:right w:val="single" w:color="AAAAAA" w:sz="4"/>
+            </w:tcBorders>
+            <w:tcMar>
+              <w:top w:type="dxa" w:w="40"/>
+              <w:left w:type="dxa" w:w="80"/>
+              <w:bottom w:type="dxa" w:w="40"/>
+              <w:right w:type="dxa" w:w="80"/>
+            </w:tcMar>
+          </w:tcPr>
+          <w:p>
+            <w:pPr>
+              <w:jc w:val="center"/>
+            </w:pPr>
+            <w:r>
+              <w:rPr>
+                <w:rFonts w:ascii="Times New Roman" w:cs="Times New Roman" w:eastAsia="Times New Roman" w:hAnsi="Times New Roman"/>
+                <w:b w:val="false"/>
+                <w:bCs w:val="false"/>
+                <w:sz w:val="18"/>
+                <w:szCs w:val="18"/>
+              </w:rPr>
+              <w:t xml:space="preserve">3.70%</w:t>
+            </w:r>
+          </w:p>
+        </w:tc>
+        <w:tc>
+          <w:tcPr>
+            <w:tcW w:type="dxa" w:w="1100"/>
+            <w:tcBorders>
+              <w:top w:val="single" w:color="AAAAAA" w:sz="4"/>
+              <w:left w:val="single" w:color="AAAAAA" w:sz="4"/>
+              <w:bottom w:val="single" w:color="AAAAAA" w:sz="4"/>
+              <w:right w:val="single" w:color="AAAAAA" w:sz="4"/>
+            </w:tcBorders>
+            <w:tcMar>
+              <w:top w:type="dxa" w:w="40"/>
+              <w:left w:type="dxa" w:w="80"/>
+              <w:bottom w:type="dxa" w:w="40"/>
+              <w:right w:type="dxa" w:w="80"/>
+            </w:tcMar>
+          </w:tcPr>
+          <w:p>
+            <w:pPr>
+              <w:jc w:val="center"/>
+            </w:pPr>
+            <w:r>
+              <w:rPr>
+                <w:rFonts w:ascii="Times New Roman" w:cs="Times New Roman" w:eastAsia="Times New Roman" w:hAnsi="Times New Roman"/>
+                <w:b w:val="false"/>
+                <w:bCs w:val="false"/>
+                <w:sz w:val="18"/>
+                <w:szCs w:val="18"/>
+              </w:rPr>
+              <w:t xml:space="preserve">0.92</w:t>
+            </w:r>
+          </w:p>
+        </w:tc>
+        <w:tc>
+          <w:tcPr>
+            <w:tcW w:type="dxa" w:w="1100"/>
+            <w:tcBorders>
+              <w:top w:val="single" w:color="AAAAAA" w:sz="4"/>
+              <w:left w:val="single" w:color="AAAAAA" w:sz="4"/>
+              <w:bottom w:val="single" w:color="AAAAAA" w:sz="4"/>
+              <w:right w:val="single" w:color="AAAAAA" w:sz="4"/>
+            </w:tcBorders>
+            <w:tcMar>
+              <w:top w:type="dxa" w:w="40"/>
+              <w:left w:type="dxa" w:w="80"/>
+              <w:bottom w:type="dxa" w:w="40"/>
+              <w:right w:type="dxa" w:w="80"/>
+            </w:tcMar>
+          </w:tcPr>
+          <w:p>
+            <w:pPr>
+              <w:jc w:val="center"/>
+            </w:pPr>
+            <w:r>
+              <w:rPr>
+                <w:rFonts w:ascii="Times New Roman" w:cs="Times New Roman" w:eastAsia="Times New Roman" w:hAnsi="Times New Roman"/>
+                <w:b w:val="false"/>
+                <w:bCs w:val="false"/>
+                <w:sz w:val="18"/>
+                <w:szCs w:val="18"/>
+              </w:rPr>
+              <w:t xml:space="preserve">34.22</w:t>
+            </w:r>
+          </w:p>
+        </w:tc>
+        <w:tc>
+          <w:tcPr>
+            <w:tcW w:type="dxa" w:w="1200"/>
+            <w:tcBorders>
+              <w:top w:val="single" w:color="AAAAAA" w:sz="4"/>
+              <w:left w:val="single" w:color="AAAAAA" w:sz="4"/>
+              <w:bottom w:val="single" w:color="AAAAAA" w:sz="4"/>
+              <w:right w:val="single" w:color="AAAAAA" w:sz="4"/>
+            </w:tcBorders>
+            <w:tcMar>
+              <w:top w:type="dxa" w:w="40"/>
+              <w:left w:type="dxa" w:w="80"/>
+              <w:bottom w:type="dxa" w:w="40"/>
+              <w:right w:type="dxa" w:w="80"/>
+            </w:tcMar>
+          </w:tcPr>
+          <w:p>
+            <w:pPr>
+              <w:jc w:val="center"/>
+            </w:pPr>
+            <w:r>
+              <w:rPr>
+                <w:rFonts w:ascii="Times New Roman" w:cs="Times New Roman" w:eastAsia="Times New Roman" w:hAnsi="Times New Roman"/>
+                <w:b w:val="false"/>
+                <w:bCs w:val="false"/>
+                <w:sz w:val="18"/>
+                <w:szCs w:val="18"/>
+              </w:rPr>
+              <w:t xml:space="preserve">2.8</w:t>
+            </w:r>
+          </w:p>
+        </w:tc>
+        <w:tc>
+          <w:tcPr>
+            <w:tcW w:type="dxa" w:w="1200"/>
+            <w:tcBorders>
+              <w:top w:val="single" w:color="AAAAAA" w:sz="4"/>
+              <w:left w:val="single" w:color="AAAAAA" w:sz="4"/>
+              <w:bottom w:val="single" w:color="AAAAAA" w:sz="4"/>
+              <w:right w:val="single" w:color="AAAAAA" w:sz="4"/>
+            </w:tcBorders>
+            <w:tcMar>
+              <w:top w:type="dxa" w:w="40"/>
+              <w:left w:type="dxa" w:w="80"/>
+              <w:bottom w:type="dxa" w:w="40"/>
+              <w:right w:type="dxa" w:w="80"/>
+            </w:tcMar>
+          </w:tcPr>
+          <w:p>
+            <w:pPr>
+              <w:jc w:val="center"/>
+            </w:pPr>
+            <w:r>
+              <w:rPr>
+                <w:rFonts w:ascii="Times New Roman" w:cs="Times New Roman" w:eastAsia="Times New Roman" w:hAnsi="Times New Roman"/>
+                <w:b w:val="false"/>
+                <w:bCs w:val="false"/>
+                <w:sz w:val="18"/>
+                <w:szCs w:val="18"/>
+              </w:rPr>
+              <w:t xml:space="preserve">47</w:t>
+            </w:r>
+          </w:p>
+        </w:tc>
+        <w:tc>
+          <w:tcPr>
+            <w:tcW w:type="dxa" w:w="1100"/>
+            <w:tcBorders>
+              <w:top w:val="single" w:color="AAAAAA" w:sz="4"/>
+              <w:left w:val="single" w:color="AAAAAA" w:sz="4"/>
+              <w:bottom w:val="single" w:color="AAAAAA" w:sz="4"/>
+              <w:right w:val="single" w:color="AAAAAA" w:sz="4"/>
+            </w:tcBorders>
+            <w:tcMar>
+              <w:top w:type="dxa" w:w="40"/>
+              <w:left w:type="dxa" w:w="80"/>
+              <w:bottom w:type="dxa" w:w="40"/>
+              <w:right w:type="dxa" w:w="80"/>
+            </w:tcMar>
+          </w:tcPr>
+          <w:p>
+            <w:pPr>
+              <w:jc w:val="center"/>
+            </w:pPr>
+            <w:r>
+              <w:rPr>
+                <w:rFonts w:ascii="Times New Roman" w:cs="Times New Roman" w:eastAsia="Times New Roman" w:hAnsi="Times New Roman"/>
+                <w:b w:val="false"/>
+                <w:bCs w:val="false"/>
+                <w:sz w:val="18"/>
+                <w:szCs w:val="18"/>
+              </w:rPr>
+              <w:t xml:space="preserve">44</w:t>
+            </w:r>
+          </w:p>
+        </w:tc>
+        <w:tc>
+          <w:tcPr>
+            <w:tcW w:type="dxa" w:w="1160"/>
+            <w:tcBorders>
+              <w:top w:val="single" w:color="AAAAAA" w:sz="4"/>
+              <w:left w:val="single" w:color="AAAAAA" w:sz="4"/>
+              <w:bottom w:val="single" w:color="AAAAAA" w:sz="4"/>
+              <w:right w:val="single" w:color="AAAAAA" w:sz="4"/>
+            </w:tcBorders>
+            <w:tcMar>
+              <w:top w:type="dxa" w:w="40"/>
+              <w:left w:type="dxa" w:w="80"/>
+              <w:bottom w:type="dxa" w:w="40"/>
+              <w:right w:type="dxa" w:w="80"/>
+            </w:tcMar>
+          </w:tcPr>
+          <w:p>
+            <w:pPr>
+              <w:jc w:val="center"/>
+            </w:pPr>
+            <w:r>
+              <w:rPr>
+                <w:rFonts w:ascii="Times New Roman" w:cs="Times New Roman" w:eastAsia="Times New Roman" w:hAnsi="Times New Roman"/>
+                <w:b w:val="false"/>
+                <w:bCs w:val="false"/>
+                <w:sz w:val="18"/>
+                <w:szCs w:val="18"/>
+              </w:rPr>
+              <w:t xml:space="preserve">$8.1</w:t>
+            </w:r>
+          </w:p>
+        </w:tc>
+      </w:tr>
+      <w:tr>
+        <w:trPr>
+          <w:cantSplit/>
+        </w:trPr>
+        <w:tc>
+          <w:tcPr>
+            <w:tcW w:type="dxa" w:w="500"/>
+            <w:tcBorders>
+              <w:top w:val="single" w:color="AAAAAA" w:sz="4"/>
+              <w:left w:val="single" w:color="AAAAAA" w:sz="4"/>
+              <w:bottom w:val="single" w:color="AAAAAA" w:sz="4"/>
+              <w:right w:val="single" w:color="AAAAAA" w:sz="4"/>
+            </w:tcBorders>
+            <w:tcMar>
+              <w:top w:type="dxa" w:w="40"/>
+              <w:left w:type="dxa" w:w="80"/>
+              <w:bottom w:type="dxa" w:w="40"/>
+              <w:right w:type="dxa" w:w="80"/>
+            </w:tcMar>
+          </w:tcPr>
+          <w:p>
+            <w:pPr>
+              <w:jc w:val="center"/>
+            </w:pPr>
+            <w:r>
+              <w:rPr>
+                <w:rFonts w:ascii="Times New Roman" w:cs="Times New Roman" w:eastAsia="Times New Roman" w:hAnsi="Times New Roman"/>
+                <w:b w:val="false"/>
+                <w:bCs w:val="false"/>
+                <w:sz w:val="18"/>
+                <w:szCs w:val="18"/>
+              </w:rPr>
+              <w:t xml:space="preserve">2</w:t>
+            </w:r>
+          </w:p>
+        </w:tc>
+        <w:tc>
+          <w:tcPr>
+            <w:tcW w:type="dxa" w:w="1100"/>
+            <w:tcBorders>
+              <w:top w:val="single" w:color="AAAAAA" w:sz="4"/>
+              <w:left w:val="single" w:color="AAAAAA" w:sz="4"/>
+              <w:bottom w:val="single" w:color="AAAAAA" w:sz="4"/>
+              <w:right w:val="single" w:color="AAAAAA" w:sz="4"/>
+            </w:tcBorders>
+            <w:tcMar>
+              <w:top w:type="dxa" w:w="40"/>
+              <w:left w:type="dxa" w:w="80"/>
+              <w:bottom w:type="dxa" w:w="40"/>
+              <w:right w:type="dxa" w:w="80"/>
+            </w:tcMar>
+          </w:tcPr>
+          <w:p>
+            <w:pPr>
+              <w:jc w:val="center"/>
+            </w:pPr>
+            <w:r>
+              <w:rPr>
+                <w:rFonts w:ascii="Times New Roman" w:cs="Times New Roman" w:eastAsia="Times New Roman" w:hAnsi="Times New Roman"/>
+                <w:b w:val="false"/>
+                <w:bCs w:val="false"/>
+                <w:sz w:val="18"/>
+                <w:szCs w:val="18"/>
+              </w:rPr>
+              <w:t xml:space="preserve">13.7</w:t>
+            </w:r>
+          </w:p>
+        </w:tc>
+        <w:tc>
+          <w:tcPr>
+            <w:tcW w:type="dxa" w:w="1100"/>
+            <w:tcBorders>
+              <w:top w:val="single" w:color="AAAAAA" w:sz="4"/>
+              <w:left w:val="single" w:color="AAAAAA" w:sz="4"/>
+              <w:bottom w:val="single" w:color="AAAAAA" w:sz="4"/>
+              <w:right w:val="single" w:color="AAAAAA" w:sz="4"/>
+            </w:tcBorders>
+            <w:tcMar>
+              <w:top w:type="dxa" w:w="40"/>
+              <w:left w:type="dxa" w:w="80"/>
+              <w:bottom w:type="dxa" w:w="40"/>
+              <w:right w:type="dxa" w:w="80"/>
+            </w:tcMar>
+          </w:tcPr>
+          <w:p>
+            <w:pPr>
+              <w:jc w:val="center"/>
+            </w:pPr>
+            <w:r>
+              <w:rPr>
+                <w:rFonts w:ascii="Times New Roman" w:cs="Times New Roman" w:eastAsia="Times New Roman" w:hAnsi="Times New Roman"/>
+                <w:b w:val="false"/>
+                <w:bCs w:val="false"/>
+                <w:sz w:val="18"/>
+                <w:szCs w:val="18"/>
+              </w:rPr>
+              <w:t xml:space="preserve">1.37%</w:t>
+            </w:r>
+          </w:p>
+        </w:tc>
+        <w:tc>
+          <w:tcPr>
+            <w:tcW w:type="dxa" w:w="1100"/>
+            <w:tcBorders>
+              <w:top w:val="single" w:color="AAAAAA" w:sz="4"/>
+              <w:left w:val="single" w:color="AAAAAA" w:sz="4"/>
+              <w:bottom w:val="single" w:color="AAAAAA" w:sz="4"/>
+              <w:right w:val="single" w:color="AAAAAA" w:sz="4"/>
+            </w:tcBorders>
+            <w:tcMar>
+              <w:top w:type="dxa" w:w="40"/>
+              <w:left w:type="dxa" w:w="80"/>
+              <w:bottom w:type="dxa" w:w="40"/>
+              <w:right w:type="dxa" w:w="80"/>
+            </w:tcMar>
+          </w:tcPr>
+          <w:p>
+            <w:pPr>
+              <w:jc w:val="center"/>
+            </w:pPr>
+            <w:r>
+              <w:rPr>
+                <w:rFonts w:ascii="Times New Roman" w:cs="Times New Roman" w:eastAsia="Times New Roman" w:hAnsi="Times New Roman"/>
+                <w:b w:val="false"/>
+                <w:bCs w:val="false"/>
+                <w:sz w:val="18"/>
+                <w:szCs w:val="18"/>
+              </w:rPr>
+              <w:t xml:space="preserve">0.34</w:t>
+            </w:r>
+          </w:p>
+        </w:tc>
+        <w:tc>
+          <w:tcPr>
+            <w:tcW w:type="dxa" w:w="1100"/>
+            <w:tcBorders>
+              <w:top w:val="single" w:color="AAAAAA" w:sz="4"/>
+              <w:left w:val="single" w:color="AAAAAA" w:sz="4"/>
+              <w:bottom w:val="single" w:color="AAAAAA" w:sz="4"/>
+              <w:right w:val="single" w:color="AAAAAA" w:sz="4"/>
+            </w:tcBorders>
+            <w:tcMar>
+              <w:top w:type="dxa" w:w="40"/>
+              <w:left w:type="dxa" w:w="80"/>
+              <w:bottom w:type="dxa" w:w="40"/>
+              <w:right w:type="dxa" w:w="80"/>
+            </w:tcMar>
+          </w:tcPr>
+          <w:p>
+            <w:pPr>
+              <w:jc w:val="center"/>
+            </w:pPr>
+            <w:r>
+              <w:rPr>
+                <w:rFonts w:ascii="Times New Roman" w:cs="Times New Roman" w:eastAsia="Times New Roman" w:hAnsi="Times New Roman"/>
+                <w:b w:val="false"/>
+                <w:bCs w:val="false"/>
+                <w:sz w:val="18"/>
+                <w:szCs w:val="18"/>
+              </w:rPr>
+              <w:t xml:space="preserve">4.69</w:t>
+            </w:r>
+          </w:p>
+        </w:tc>
+        <w:tc>
+          <w:tcPr>
+            <w:tcW w:type="dxa" w:w="1200"/>
+            <w:tcBorders>
+              <w:top w:val="single" w:color="AAAAAA" w:sz="4"/>
+              <w:left w:val="single" w:color="AAAAAA" w:sz="4"/>
+              <w:bottom w:val="single" w:color="AAAAAA" w:sz="4"/>
+              <w:right w:val="single" w:color="AAAAAA" w:sz="4"/>
+            </w:tcBorders>
+            <w:tcMar>
+              <w:top w:type="dxa" w:w="40"/>
+              <w:left w:type="dxa" w:w="80"/>
+              <w:bottom w:type="dxa" w:w="40"/>
+              <w:right w:type="dxa" w:w="80"/>
+            </w:tcMar>
+          </w:tcPr>
+          <w:p>
+            <w:pPr>
+              <w:jc w:val="center"/>
+            </w:pPr>
+            <w:r>
+              <w:rPr>
+                <w:rFonts w:ascii="Times New Roman" w:cs="Times New Roman" w:eastAsia="Times New Roman" w:hAnsi="Times New Roman"/>
+                <w:b w:val="false"/>
+                <w:bCs w:val="false"/>
+                <w:sz w:val="18"/>
+                <w:szCs w:val="18"/>
+              </w:rPr>
+              <w:t xml:space="preserve">9.0</w:t>
+            </w:r>
+          </w:p>
+        </w:tc>
+        <w:tc>
+          <w:tcPr>
+            <w:tcW w:type="dxa" w:w="1200"/>
+            <w:tcBorders>
+              <w:top w:val="single" w:color="AAAAAA" w:sz="4"/>
+              <w:left w:val="single" w:color="AAAAAA" w:sz="4"/>
+              <w:bottom w:val="single" w:color="AAAAAA" w:sz="4"/>
+              <w:right w:val="single" w:color="AAAAAA" w:sz="4"/>
+            </w:tcBorders>
+            <w:tcMar>
+              <w:top w:type="dxa" w:w="40"/>
+              <w:left w:type="dxa" w:w="80"/>
+              <w:bottom w:type="dxa" w:w="40"/>
+              <w:right w:type="dxa" w:w="80"/>
+            </w:tcMar>
+          </w:tcPr>
+          <w:p>
+            <w:pPr>
+              <w:jc w:val="center"/>
+            </w:pPr>
+            <w:r>
+              <w:rPr>
+                <w:rFonts w:ascii="Times New Roman" w:cs="Times New Roman" w:eastAsia="Times New Roman" w:hAnsi="Times New Roman"/>
+                <w:b w:val="false"/>
+                <w:bCs w:val="false"/>
+                <w:sz w:val="18"/>
+                <w:szCs w:val="18"/>
+              </w:rPr>
+              <w:t xml:space="preserve">20</w:t>
+            </w:r>
+          </w:p>
+        </w:tc>
+        <w:tc>
+          <w:tcPr>
+            <w:tcW w:type="dxa" w:w="1100"/>
+            <w:tcBorders>
+              <w:top w:val="single" w:color="AAAAAA" w:sz="4"/>
+              <w:left w:val="single" w:color="AAAAAA" w:sz="4"/>
+              <w:bottom w:val="single" w:color="AAAAAA" w:sz="4"/>
+              <w:right w:val="single" w:color="AAAAAA" w:sz="4"/>
+            </w:tcBorders>
+            <w:tcMar>
+              <w:top w:type="dxa" w:w="40"/>
+              <w:left w:type="dxa" w:w="80"/>
+              <w:bottom w:type="dxa" w:w="40"/>
+              <w:right w:type="dxa" w:w="80"/>
+            </w:tcMar>
+          </w:tcPr>
+          <w:p>
+            <w:pPr>
+              <w:jc w:val="center"/>
+            </w:pPr>
+            <w:r>
+              <w:rPr>
+                <w:rFonts w:ascii="Times New Roman" w:cs="Times New Roman" w:eastAsia="Times New Roman" w:hAnsi="Times New Roman"/>
+                <w:b w:val="false"/>
+                <w:bCs w:val="false"/>
+                <w:sz w:val="18"/>
+                <w:szCs w:val="18"/>
+              </w:rPr>
+              <w:t xml:space="preserve">8</w:t>
+            </w:r>
+          </w:p>
+        </w:tc>
+        <w:tc>
+          <w:tcPr>
+            <w:tcW w:type="dxa" w:w="1160"/>
+            <w:tcBorders>
+              <w:top w:val="single" w:color="AAAAAA" w:sz="4"/>
+              <w:left w:val="single" w:color="AAAAAA" w:sz="4"/>
+              <w:bottom w:val="single" w:color="AAAAAA" w:sz="4"/>
+              <w:right w:val="single" w:color="AAAAAA" w:sz="4"/>
+            </w:tcBorders>
+            <w:tcMar>
+              <w:top w:type="dxa" w:w="40"/>
+              <w:left w:type="dxa" w:w="80"/>
+              <w:bottom w:type="dxa" w:w="40"/>
+              <w:right w:type="dxa" w:w="80"/>
+            </w:tcMar>
+          </w:tcPr>
+          <w:p>
+            <w:pPr>
+              <w:jc w:val="center"/>
+            </w:pPr>
+            <w:r>
+              <w:rPr>
+                <w:rFonts w:ascii="Times New Roman" w:cs="Times New Roman" w:eastAsia="Times New Roman" w:hAnsi="Times New Roman"/>
+                <w:b w:val="false"/>
+                <w:bCs w:val="false"/>
+                <w:sz w:val="18"/>
+                <w:szCs w:val="18"/>
+              </w:rPr>
+              <w:t xml:space="preserve">$22</w:t>
+            </w:r>
+          </w:p>
+        </w:tc>
+      </w:tr>
+      <w:tr>
+        <w:trPr>
+          <w:cantSplit/>
+        </w:trPr>
+        <w:tc>
+          <w:tcPr>
+            <w:tcW w:type="dxa" w:w="500"/>
+            <w:tcBorders>
+              <w:top w:val="single" w:color="AAAAAA" w:sz="4"/>
+              <w:left w:val="single" w:color="AAAAAA" w:sz="4"/>
+              <w:bottom w:val="single" w:color="AAAAAA" w:sz="4"/>
+              <w:right w:val="single" w:color="AAAAAA" w:sz="4"/>
+            </w:tcBorders>
+            <w:tcMar>
+              <w:top w:type="dxa" w:w="40"/>
+              <w:left w:type="dxa" w:w="80"/>
+              <w:bottom w:type="dxa" w:w="40"/>
+              <w:right w:type="dxa" w:w="80"/>
+            </w:tcMar>
+          </w:tcPr>
+          <w:p>
+            <w:pPr>
+              <w:jc w:val="center"/>
+            </w:pPr>
+            <w:r>
+              <w:rPr>
+                <w:rFonts w:ascii="Times New Roman" w:cs="Times New Roman" w:eastAsia="Times New Roman" w:hAnsi="Times New Roman"/>
+                <w:b w:val="false"/>
+                <w:bCs w:val="false"/>
+                <w:sz w:val="18"/>
+                <w:szCs w:val="18"/>
+              </w:rPr>
+              <w:t xml:space="preserve">3</w:t>
+            </w:r>
+          </w:p>
+        </w:tc>
+        <w:tc>
+          <w:tcPr>
+            <w:tcW w:type="dxa" w:w="1100"/>
+            <w:tcBorders>
+              <w:top w:val="single" w:color="AAAAAA" w:sz="4"/>
+              <w:left w:val="single" w:color="AAAAAA" w:sz="4"/>
+              <w:bottom w:val="single" w:color="AAAAAA" w:sz="4"/>
+              <w:right w:val="single" w:color="AAAAAA" w:sz="4"/>
+            </w:tcBorders>
+            <w:tcMar>
+              <w:top w:type="dxa" w:w="40"/>
+              <w:left w:type="dxa" w:w="80"/>
+              <w:bottom w:type="dxa" w:w="40"/>
+              <w:right w:type="dxa" w:w="80"/>
+            </w:tcMar>
+          </w:tcPr>
+          <w:p>
+            <w:pPr>
+              <w:jc w:val="center"/>
+            </w:pPr>
+            <w:r>
+              <w:rPr>
+                <w:rFonts w:ascii="Times New Roman" w:cs="Times New Roman" w:eastAsia="Times New Roman" w:hAnsi="Times New Roman"/>
+                <w:b w:val="false"/>
+                <w:bCs w:val="false"/>
+                <w:sz w:val="18"/>
+                <w:szCs w:val="18"/>
+              </w:rPr>
+              <w:t xml:space="preserve">5.1</w:t>
+            </w:r>
+          </w:p>
+        </w:tc>
+        <w:tc>
+          <w:tcPr>
+            <w:tcW w:type="dxa" w:w="1100"/>
+            <w:tcBorders>
+              <w:top w:val="single" w:color="AAAAAA" w:sz="4"/>
+              <w:left w:val="single" w:color="AAAAAA" w:sz="4"/>
+              <w:bottom w:val="single" w:color="AAAAAA" w:sz="4"/>
+              <w:right w:val="single" w:color="AAAAAA" w:sz="4"/>
+            </w:tcBorders>
+            <w:tcMar>
+              <w:top w:type="dxa" w:w="40"/>
+              <w:left w:type="dxa" w:w="80"/>
+              <w:bottom w:type="dxa" w:w="40"/>
+              <w:right w:type="dxa" w:w="80"/>
+            </w:tcMar>
+          </w:tcPr>
+          <w:p>
+            <w:pPr>
+              <w:jc w:val="center"/>
+            </w:pPr>
+            <w:r>
+              <w:rPr>
+                <w:rFonts w:ascii="Times New Roman" w:cs="Times New Roman" w:eastAsia="Times New Roman" w:hAnsi="Times New Roman"/>
+                <w:b w:val="false"/>
+                <w:bCs w:val="false"/>
+                <w:sz w:val="18"/>
+                <w:szCs w:val="18"/>
+              </w:rPr>
+              <w:t xml:space="preserve">0.51%</w:t>
+            </w:r>
+          </w:p>
+        </w:tc>
+        <w:tc>
+          <w:tcPr>
+            <w:tcW w:type="dxa" w:w="1100"/>
+            <w:tcBorders>
+              <w:top w:val="single" w:color="AAAAAA" w:sz="4"/>
+              <w:left w:val="single" w:color="AAAAAA" w:sz="4"/>
+              <w:bottom w:val="single" w:color="AAAAAA" w:sz="4"/>
+              <w:right w:val="single" w:color="AAAAAA" w:sz="4"/>
+            </w:tcBorders>
+            <w:tcMar>
+              <w:top w:type="dxa" w:w="40"/>
+              <w:left w:type="dxa" w:w="80"/>
+              <w:bottom w:type="dxa" w:w="40"/>
+              <w:right w:type="dxa" w:w="80"/>
+            </w:tcMar>
+          </w:tcPr>
+          <w:p>
+            <w:pPr>
+              <w:jc w:val="center"/>
+            </w:pPr>
+            <w:r>
+              <w:rPr>
+                <w:rFonts w:ascii="Times New Roman" w:cs="Times New Roman" w:eastAsia="Times New Roman" w:hAnsi="Times New Roman"/>
+                <w:b w:val="false"/>
+                <w:bCs w:val="false"/>
+                <w:sz w:val="18"/>
+                <w:szCs w:val="18"/>
+              </w:rPr>
+              <w:t xml:space="preserve">0.13</w:t>
+            </w:r>
+          </w:p>
+        </w:tc>
+        <w:tc>
+          <w:tcPr>
+            <w:tcW w:type="dxa" w:w="1100"/>
+            <w:tcBorders>
+              <w:top w:val="single" w:color="AAAAAA" w:sz="4"/>
+              <w:left w:val="single" w:color="AAAAAA" w:sz="4"/>
+              <w:bottom w:val="single" w:color="AAAAAA" w:sz="4"/>
+              <w:right w:val="single" w:color="AAAAAA" w:sz="4"/>
+            </w:tcBorders>
+            <w:tcMar>
+              <w:top w:type="dxa" w:w="40"/>
+              <w:left w:type="dxa" w:w="80"/>
+              <w:bottom w:type="dxa" w:w="40"/>
+              <w:right w:type="dxa" w:w="80"/>
+            </w:tcMar>
+          </w:tcPr>
+          <w:p>
+            <w:pPr>
+              <w:jc w:val="center"/>
+            </w:pPr>
+            <w:r>
+              <w:rPr>
+                <w:rFonts w:ascii="Times New Roman" w:cs="Times New Roman" w:eastAsia="Times New Roman" w:hAnsi="Times New Roman"/>
+                <w:b w:val="false"/>
+                <w:bCs w:val="false"/>
+                <w:sz w:val="18"/>
+                <w:szCs w:val="18"/>
+              </w:rPr>
+              <w:t xml:space="preserve">0.64</w:t>
+            </w:r>
+          </w:p>
+        </w:tc>
+        <w:tc>
+          <w:tcPr>
+            <w:tcW w:type="dxa" w:w="1200"/>
+            <w:tcBorders>
+              <w:top w:val="single" w:color="AAAAAA" w:sz="4"/>
+              <w:left w:val="single" w:color="AAAAAA" w:sz="4"/>
+              <w:bottom w:val="single" w:color="AAAAAA" w:sz="4"/>
+              <w:right w:val="single" w:color="AAAAAA" w:sz="4"/>
+            </w:tcBorders>
+            <w:tcMar>
+              <w:top w:type="dxa" w:w="40"/>
+              <w:left w:type="dxa" w:w="80"/>
+              <w:bottom w:type="dxa" w:w="40"/>
+              <w:right w:type="dxa" w:w="80"/>
+            </w:tcMar>
+          </w:tcPr>
+          <w:p>
+            <w:pPr>
+              <w:jc w:val="center"/>
+            </w:pPr>
+            <w:r>
+              <w:rPr>
+                <w:rFonts w:ascii="Times New Roman" w:cs="Times New Roman" w:eastAsia="Times New Roman" w:hAnsi="Times New Roman"/>
+                <w:b w:val="false"/>
+                <w:bCs w:val="false"/>
+                <w:sz w:val="18"/>
+                <w:szCs w:val="18"/>
+              </w:rPr>
+              <w:t xml:space="preserve">4.4</w:t>
+            </w:r>
+          </w:p>
+        </w:tc>
+        <w:tc>
+          <w:tcPr>
+            <w:tcW w:type="dxa" w:w="1200"/>
+            <w:tcBorders>
+              <w:top w:val="single" w:color="AAAAAA" w:sz="4"/>
+              <w:left w:val="single" w:color="AAAAAA" w:sz="4"/>
+              <w:bottom w:val="single" w:color="AAAAAA" w:sz="4"/>
+              <w:right w:val="single" w:color="AAAAAA" w:sz="4"/>
+            </w:tcBorders>
+            <w:tcMar>
+              <w:top w:type="dxa" w:w="40"/>
+              <w:left w:type="dxa" w:w="80"/>
+              <w:bottom w:type="dxa" w:w="40"/>
+              <w:right w:type="dxa" w:w="80"/>
+            </w:tcMar>
+          </w:tcPr>
+          <w:p>
+            <w:pPr>
+              <w:jc w:val="center"/>
+            </w:pPr>
+            <w:r>
+              <w:rPr>
+                <w:rFonts w:ascii="Times New Roman" w:cs="Times New Roman" w:eastAsia="Times New Roman" w:hAnsi="Times New Roman"/>
+                <w:b w:val="false"/>
+                <w:bCs w:val="false"/>
+                <w:sz w:val="18"/>
+                <w:szCs w:val="18"/>
+              </w:rPr>
+              <w:t xml:space="preserve">9</w:t>
+            </w:r>
+          </w:p>
+        </w:tc>
+        <w:tc>
+          <w:tcPr>
+            <w:tcW w:type="dxa" w:w="1100"/>
+            <w:tcBorders>
+              <w:top w:val="single" w:color="AAAAAA" w:sz="4"/>
+              <w:left w:val="single" w:color="AAAAAA" w:sz="4"/>
+              <w:bottom w:val="single" w:color="AAAAAA" w:sz="4"/>
+              <w:right w:val="single" w:color="AAAAAA" w:sz="4"/>
+            </w:tcBorders>
+            <w:tcMar>
+              <w:top w:type="dxa" w:w="40"/>
+              <w:left w:type="dxa" w:w="80"/>
+              <w:bottom w:type="dxa" w:w="40"/>
+              <w:right w:type="dxa" w:w="80"/>
+            </w:tcMar>
+          </w:tcPr>
+          <w:p>
+            <w:pPr>
+              <w:jc w:val="center"/>
+            </w:pPr>
+            <w:r>
+              <w:rPr>
+                <w:rFonts w:ascii="Times New Roman" w:cs="Times New Roman" w:eastAsia="Times New Roman" w:hAnsi="Times New Roman"/>
+                <w:b w:val="false"/>
+                <w:bCs w:val="false"/>
+                <w:sz w:val="18"/>
+                <w:szCs w:val="18"/>
+              </w:rPr>
+              <w:t xml:space="preserve">2</w:t>
+            </w:r>
+          </w:p>
+        </w:tc>
+        <w:tc>
+          <w:tcPr>
+            <w:tcW w:type="dxa" w:w="1160"/>
+            <w:tcBorders>
+              <w:top w:val="single" w:color="AAAAAA" w:sz="4"/>
+              <w:left w:val="single" w:color="AAAAAA" w:sz="4"/>
+              <w:bottom w:val="single" w:color="AAAAAA" w:sz="4"/>
+              <w:right w:val="single" w:color="AAAAAA" w:sz="4"/>
+            </w:tcBorders>
+            <w:tcMar>
+              <w:top w:type="dxa" w:w="40"/>
+              <w:left w:type="dxa" w:w="80"/>
+              <w:bottom w:type="dxa" w:w="40"/>
+              <w:right w:type="dxa" w:w="80"/>
+            </w:tcMar>
+          </w:tcPr>
+          <w:p>
+            <w:pPr>
+              <w:jc w:val="center"/>
+            </w:pPr>
+            <w:r>
+              <w:rPr>
+                <w:rFonts w:ascii="Times New Roman" w:cs="Times New Roman" w:eastAsia="Times New Roman" w:hAnsi="Times New Roman"/>
+                <w:b w:val="false"/>
+                <w:bCs w:val="false"/>
+                <w:sz w:val="18"/>
+                <w:szCs w:val="18"/>
+              </w:rPr>
+              <w:t xml:space="preserve">$59</w:t>
+            </w:r>
+          </w:p>
+        </w:tc>
+      </w:tr>
+      <w:tr>
+        <w:trPr>
+          <w:cantSplit/>
+        </w:trPr>
+        <w:tc>
+          <w:tcPr>
+            <w:tcW w:type="dxa" w:w="500"/>
+            <w:tcBorders>
+              <w:top w:val="single" w:color="AAAAAA" w:sz="4"/>
+              <w:left w:val="single" w:color="AAAAAA" w:sz="4"/>
+              <w:bottom w:val="single" w:color="AAAAAA" w:sz="4"/>
+              <w:right w:val="single" w:color="AAAAAA" w:sz="4"/>
+            </w:tcBorders>
+            <w:tcMar>
+              <w:top w:type="dxa" w:w="40"/>
+              <w:left w:type="dxa" w:w="80"/>
+              <w:bottom w:type="dxa" w:w="40"/>
+              <w:right w:type="dxa" w:w="80"/>
+            </w:tcMar>
+          </w:tcPr>
+          <w:p>
+            <w:pPr>
+              <w:jc w:val="center"/>
+            </w:pPr>
+            <w:r>
+              <w:rPr>
+                <w:rFonts w:ascii="Times New Roman" w:cs="Times New Roman" w:eastAsia="Times New Roman" w:hAnsi="Times New Roman"/>
+                <w:b w:val="false"/>
+                <w:bCs w:val="false"/>
+                <w:sz w:val="18"/>
+                <w:szCs w:val="18"/>
+              </w:rPr>
+              <w:t xml:space="preserve">4</w:t>
+            </w:r>
+          </w:p>
+        </w:tc>
+        <w:tc>
+          <w:tcPr>
+            <w:tcW w:type="dxa" w:w="1100"/>
+            <w:tcBorders>
+              <w:top w:val="single" w:color="AAAAAA" w:sz="4"/>
+              <w:left w:val="single" w:color="AAAAAA" w:sz="4"/>
+              <w:bottom w:val="single" w:color="AAAAAA" w:sz="4"/>
+              <w:right w:val="single" w:color="AAAAAA" w:sz="4"/>
+            </w:tcBorders>
+            <w:tcMar>
+              <w:top w:type="dxa" w:w="40"/>
+              <w:left w:type="dxa" w:w="80"/>
+              <w:bottom w:type="dxa" w:w="40"/>
+              <w:right w:type="dxa" w:w="80"/>
+            </w:tcMar>
+          </w:tcPr>
+          <w:p>
+            <w:pPr>
+              <w:jc w:val="center"/>
+            </w:pPr>
+            <w:r>
+              <w:rPr>
+                <w:rFonts w:ascii="Times New Roman" w:cs="Times New Roman" w:eastAsia="Times New Roman" w:hAnsi="Times New Roman"/>
+                <w:b w:val="false"/>
+                <w:bCs w:val="false"/>
+                <w:sz w:val="18"/>
+                <w:szCs w:val="18"/>
+              </w:rPr>
+              <w:t xml:space="preserve">1.9</w:t>
+            </w:r>
+          </w:p>
+        </w:tc>
+        <w:tc>
+          <w:tcPr>
+            <w:tcW w:type="dxa" w:w="1100"/>
+            <w:tcBorders>
+              <w:top w:val="single" w:color="AAAAAA" w:sz="4"/>
+              <w:left w:val="single" w:color="AAAAAA" w:sz="4"/>
+              <w:bottom w:val="single" w:color="AAAAAA" w:sz="4"/>
+              <w:right w:val="single" w:color="AAAAAA" w:sz="4"/>
+            </w:tcBorders>
+            <w:tcMar>
+              <w:top w:type="dxa" w:w="40"/>
+              <w:left w:type="dxa" w:w="80"/>
+              <w:bottom w:type="dxa" w:w="40"/>
+              <w:right w:type="dxa" w:w="80"/>
+            </w:tcMar>
+          </w:tcPr>
+          <w:p>
+            <w:pPr>
+              <w:jc w:val="center"/>
+            </w:pPr>
+            <w:r>
+              <w:rPr>
+                <w:rFonts w:ascii="Times New Roman" w:cs="Times New Roman" w:eastAsia="Times New Roman" w:hAnsi="Times New Roman"/>
+                <w:b w:val="false"/>
+                <w:bCs w:val="false"/>
+                <w:sz w:val="18"/>
+                <w:szCs w:val="18"/>
+              </w:rPr>
+              <w:t xml:space="preserve">0.19%</w:t>
+            </w:r>
+          </w:p>
+        </w:tc>
+        <w:tc>
+          <w:tcPr>
+            <w:tcW w:type="dxa" w:w="1100"/>
+            <w:tcBorders>
+              <w:top w:val="single" w:color="AAAAAA" w:sz="4"/>
+              <w:left w:val="single" w:color="AAAAAA" w:sz="4"/>
+              <w:bottom w:val="single" w:color="AAAAAA" w:sz="4"/>
+              <w:right w:val="single" w:color="AAAAAA" w:sz="4"/>
+            </w:tcBorders>
+            <w:tcMar>
+              <w:top w:type="dxa" w:w="40"/>
+              <w:left w:type="dxa" w:w="80"/>
+              <w:bottom w:type="dxa" w:w="40"/>
+              <w:right w:type="dxa" w:w="80"/>
+            </w:tcMar>
+          </w:tcPr>
+          <w:p>
+            <w:pPr>
+              <w:jc w:val="center"/>
+            </w:pPr>
+            <w:r>
+              <w:rPr>
+                <w:rFonts w:ascii="Times New Roman" w:cs="Times New Roman" w:eastAsia="Times New Roman" w:hAnsi="Times New Roman"/>
+                <w:b w:val="false"/>
+                <w:bCs w:val="false"/>
+                <w:sz w:val="18"/>
+                <w:szCs w:val="18"/>
+              </w:rPr>
+              <w:t xml:space="preserve">0.05</w:t>
+            </w:r>
+          </w:p>
+        </w:tc>
+        <w:tc>
+          <w:tcPr>
+            <w:tcW w:type="dxa" w:w="1100"/>
+            <w:tcBorders>
+              <w:top w:val="single" w:color="AAAAAA" w:sz="4"/>
+              <w:left w:val="single" w:color="AAAAAA" w:sz="4"/>
+              <w:bottom w:val="single" w:color="AAAAAA" w:sz="4"/>
+              <w:right w:val="single" w:color="AAAAAA" w:sz="4"/>
+            </w:tcBorders>
+            <w:tcMar>
+              <w:top w:type="dxa" w:w="40"/>
+              <w:left w:type="dxa" w:w="80"/>
+              <w:bottom w:type="dxa" w:w="40"/>
+              <w:right w:type="dxa" w:w="80"/>
+            </w:tcMar>
+          </w:tcPr>
+          <w:p>
+            <w:pPr>
+              <w:jc w:val="center"/>
+            </w:pPr>
+            <w:r>
+              <w:rPr>
+                <w:rFonts w:ascii="Times New Roman" w:cs="Times New Roman" w:eastAsia="Times New Roman" w:hAnsi="Times New Roman"/>
+                <w:b w:val="false"/>
+                <w:bCs w:val="false"/>
+                <w:sz w:val="18"/>
+                <w:szCs w:val="18"/>
+              </w:rPr>
+              <w:t xml:space="preserve">0.09</w:t>
+            </w:r>
+          </w:p>
+        </w:tc>
+        <w:tc>
+          <w:tcPr>
+            <w:tcW w:type="dxa" w:w="1200"/>
+            <w:tcBorders>
+              <w:top w:val="single" w:color="AAAAAA" w:sz="4"/>
+              <w:left w:val="single" w:color="AAAAAA" w:sz="4"/>
+              <w:bottom w:val="single" w:color="AAAAAA" w:sz="4"/>
+              <w:right w:val="single" w:color="AAAAAA" w:sz="4"/>
+            </w:tcBorders>
+            <w:tcMar>
+              <w:top w:type="dxa" w:w="40"/>
+              <w:left w:type="dxa" w:w="80"/>
+              <w:bottom w:type="dxa" w:w="40"/>
+              <w:right w:type="dxa" w:w="80"/>
+            </w:tcMar>
+          </w:tcPr>
+          <w:p>
+            <w:pPr>
+              <w:jc w:val="center"/>
+            </w:pPr>
+            <w:r>
+              <w:rPr>
+                <w:rFonts w:ascii="Times New Roman" w:cs="Times New Roman" w:eastAsia="Times New Roman" w:hAnsi="Times New Roman"/>
+                <w:b w:val="false"/>
+                <w:bCs w:val="false"/>
+                <w:sz w:val="18"/>
+                <w:szCs w:val="18"/>
+              </w:rPr>
+              <w:t xml:space="preserve">1.8</w:t>
+            </w:r>
+          </w:p>
+        </w:tc>
+        <w:tc>
+          <w:tcPr>
+            <w:tcW w:type="dxa" w:w="1200"/>
+            <w:tcBorders>
+              <w:top w:val="single" w:color="AAAAAA" w:sz="4"/>
+              <w:left w:val="single" w:color="AAAAAA" w:sz="4"/>
+              <w:bottom w:val="single" w:color="AAAAAA" w:sz="4"/>
+              <w:right w:val="single" w:color="AAAAAA" w:sz="4"/>
+            </w:tcBorders>
+            <w:tcMar>
+              <w:top w:type="dxa" w:w="40"/>
+              <w:left w:type="dxa" w:w="80"/>
+              <w:bottom w:type="dxa" w:w="40"/>
+              <w:right w:type="dxa" w:w="80"/>
+            </w:tcMar>
+          </w:tcPr>
+          <w:p>
+            <w:pPr>
+              <w:jc w:val="center"/>
+            </w:pPr>
+            <w:r>
+              <w:rPr>
+                <w:rFonts w:ascii="Times New Roman" w:cs="Times New Roman" w:eastAsia="Times New Roman" w:hAnsi="Times New Roman"/>
+                <w:b w:val="false"/>
+                <w:bCs w:val="false"/>
+                <w:sz w:val="18"/>
+                <w:szCs w:val="18"/>
+              </w:rPr>
+              <w:t xml:space="preserve">4</w:t>
+            </w:r>
+          </w:p>
+        </w:tc>
+        <w:tc>
+          <w:tcPr>
+            <w:tcW w:type="dxa" w:w="1100"/>
+            <w:tcBorders>
+              <w:top w:val="single" w:color="AAAAAA" w:sz="4"/>
+              <w:left w:val="single" w:color="AAAAAA" w:sz="4"/>
+              <w:bottom w:val="single" w:color="AAAAAA" w:sz="4"/>
+              <w:right w:val="single" w:color="AAAAAA" w:sz="4"/>
+            </w:tcBorders>
+            <w:tcMar>
+              <w:top w:type="dxa" w:w="40"/>
+              <w:left w:type="dxa" w:w="80"/>
+              <w:bottom w:type="dxa" w:w="40"/>
+              <w:right w:type="dxa" w:w="80"/>
+            </w:tcMar>
+          </w:tcPr>
+          <w:p>
+            <w:pPr>
+              <w:jc w:val="center"/>
+            </w:pPr>
+            <w:r>
+              <w:rPr>
+                <w:rFonts w:ascii="Times New Roman" w:cs="Times New Roman" w:eastAsia="Times New Roman" w:hAnsi="Times New Roman"/>
+                <w:b w:val="false"/>
+                <w:bCs w:val="false"/>
+                <w:sz w:val="18"/>
+                <w:szCs w:val="18"/>
+              </w:rPr>
+              <w:t xml:space="preserve">1</w:t>
+            </w:r>
+          </w:p>
+        </w:tc>
+        <w:tc>
+          <w:tcPr>
+            <w:tcW w:type="dxa" w:w="1160"/>
+            <w:tcBorders>
+              <w:top w:val="single" w:color="AAAAAA" w:sz="4"/>
+              <w:left w:val="single" w:color="AAAAAA" w:sz="4"/>
+              <w:bottom w:val="single" w:color="AAAAAA" w:sz="4"/>
+              <w:right w:val="single" w:color="AAAAAA" w:sz="4"/>
+            </w:tcBorders>
+            <w:tcMar>
+              <w:top w:type="dxa" w:w="40"/>
+              <w:left w:type="dxa" w:w="80"/>
+              <w:bottom w:type="dxa" w:w="40"/>
+              <w:right w:type="dxa" w:w="80"/>
+            </w:tcMar>
+          </w:tcPr>
+          <w:p>
+            <w:pPr>
+              <w:jc w:val="center"/>
+            </w:pPr>
+            <w:r>
+              <w:rPr>
+                <w:rFonts w:ascii="Times New Roman" w:cs="Times New Roman" w:eastAsia="Times New Roman" w:hAnsi="Times New Roman"/>
+                <w:b w:val="false"/>
+                <w:bCs w:val="false"/>
+                <w:sz w:val="18"/>
+                <w:szCs w:val="18"/>
+              </w:rPr>
+              <w:t xml:space="preserve">$160</w:t>
+            </w:r>
+          </w:p>
+        </w:tc>
+      </w:tr>
+      <w:tr>
+        <w:trPr>
+          <w:cantSplit/>
+        </w:trPr>
+        <w:tc>
+          <w:tcPr>
+            <w:tcW w:type="dxa" w:w="500"/>
+            <w:tcBorders>
+              <w:top w:val="single" w:color="AAAAAA" w:sz="4"/>
+              <w:left w:val="single" w:color="AAAAAA" w:sz="4"/>
+              <w:bottom w:val="single" w:color="AAAAAA" w:sz="4"/>
+              <w:right w:val="single" w:color="AAAAAA" w:sz="4"/>
+            </w:tcBorders>
+            <w:tcMar>
+              <w:top w:type="dxa" w:w="40"/>
+              <w:left w:type="dxa" w:w="80"/>
+              <w:bottom w:type="dxa" w:w="40"/>
+              <w:right w:type="dxa" w:w="80"/>
+            </w:tcMar>
+          </w:tcPr>
+          <w:p>
+            <w:pPr>
+              <w:jc w:val="center"/>
+            </w:pPr>
+            <w:r>
+              <w:rPr>
+                <w:rFonts w:ascii="Times New Roman" w:cs="Times New Roman" w:eastAsia="Times New Roman" w:hAnsi="Times New Roman"/>
+                <w:b w:val="false"/>
+                <w:bCs w:val="false"/>
+                <w:sz w:val="18"/>
+                <w:szCs w:val="18"/>
+              </w:rPr>
+              <w:t xml:space="preserve">5</w:t>
+            </w:r>
+          </w:p>
+        </w:tc>
+        <w:tc>
+          <w:tcPr>
+            <w:tcW w:type="dxa" w:w="1100"/>
+            <w:tcBorders>
+              <w:top w:val="single" w:color="AAAAAA" w:sz="4"/>
+              <w:left w:val="single" w:color="AAAAAA" w:sz="4"/>
+              <w:bottom w:val="single" w:color="AAAAAA" w:sz="4"/>
+              <w:right w:val="single" w:color="AAAAAA" w:sz="4"/>
+            </w:tcBorders>
+            <w:tcMar>
+              <w:top w:type="dxa" w:w="40"/>
+              <w:left w:type="dxa" w:w="80"/>
+              <w:bottom w:type="dxa" w:w="40"/>
+              <w:right w:type="dxa" w:w="80"/>
+            </w:tcMar>
+          </w:tcPr>
+          <w:p>
+            <w:pPr>
+              <w:jc w:val="center"/>
+            </w:pPr>
+            <w:r>
+              <w:rPr>
+                <w:rFonts w:ascii="Times New Roman" w:cs="Times New Roman" w:eastAsia="Times New Roman" w:hAnsi="Times New Roman"/>
+                <w:b w:val="false"/>
+                <w:bCs w:val="false"/>
+                <w:sz w:val="18"/>
+                <w:szCs w:val="18"/>
+              </w:rPr>
+              <w:t xml:space="preserve">0.7</w:t>
+            </w:r>
+          </w:p>
+        </w:tc>
+        <w:tc>
+          <w:tcPr>
+            <w:tcW w:type="dxa" w:w="1100"/>
+            <w:tcBorders>
+              <w:top w:val="single" w:color="AAAAAA" w:sz="4"/>
+              <w:left w:val="single" w:color="AAAAAA" w:sz="4"/>
+              <w:bottom w:val="single" w:color="AAAAAA" w:sz="4"/>
+              <w:right w:val="single" w:color="AAAAAA" w:sz="4"/>
+            </w:tcBorders>
+            <w:tcMar>
+              <w:top w:type="dxa" w:w="40"/>
+              <w:left w:type="dxa" w:w="80"/>
+              <w:bottom w:type="dxa" w:w="40"/>
+              <w:right w:type="dxa" w:w="80"/>
+            </w:tcMar>
+          </w:tcPr>
+          <w:p>
+            <w:pPr>
+              <w:jc w:val="center"/>
+            </w:pPr>
+            <w:r>
+              <w:rPr>
+                <w:rFonts w:ascii="Times New Roman" w:cs="Times New Roman" w:eastAsia="Times New Roman" w:hAnsi="Times New Roman"/>
+                <w:b w:val="false"/>
+                <w:bCs w:val="false"/>
+                <w:sz w:val="18"/>
+                <w:szCs w:val="18"/>
+              </w:rPr>
+              <w:t xml:space="preserve">0.07%</w:t>
+            </w:r>
+          </w:p>
+        </w:tc>
+        <w:tc>
+          <w:tcPr>
+            <w:tcW w:type="dxa" w:w="1100"/>
+            <w:tcBorders>
+              <w:top w:val="single" w:color="AAAAAA" w:sz="4"/>
+              <w:left w:val="single" w:color="AAAAAA" w:sz="4"/>
+              <w:bottom w:val="single" w:color="AAAAAA" w:sz="4"/>
+              <w:right w:val="single" w:color="AAAAAA" w:sz="4"/>
+            </w:tcBorders>
+            <w:tcMar>
+              <w:top w:type="dxa" w:w="40"/>
+              <w:left w:type="dxa" w:w="80"/>
+              <w:bottom w:type="dxa" w:w="40"/>
+              <w:right w:type="dxa" w:w="80"/>
+            </w:tcMar>
+          </w:tcPr>
+          <w:p>
+            <w:pPr>
+              <w:jc w:val="center"/>
+            </w:pPr>
+            <w:r>
+              <w:rPr>
+                <w:rFonts w:ascii="Times New Roman" w:cs="Times New Roman" w:eastAsia="Times New Roman" w:hAnsi="Times New Roman"/>
+                <w:b w:val="false"/>
+                <w:bCs w:val="false"/>
+                <w:sz w:val="18"/>
+                <w:szCs w:val="18"/>
+              </w:rPr>
+              <w:t xml:space="preserve">0.02</w:t>
+            </w:r>
+          </w:p>
+        </w:tc>
+        <w:tc>
+          <w:tcPr>
+            <w:tcW w:type="dxa" w:w="1100"/>
+            <w:tcBorders>
+              <w:top w:val="single" w:color="AAAAAA" w:sz="4"/>
+              <w:left w:val="single" w:color="AAAAAA" w:sz="4"/>
+              <w:bottom w:val="single" w:color="AAAAAA" w:sz="4"/>
+              <w:right w:val="single" w:color="AAAAAA" w:sz="4"/>
+            </w:tcBorders>
+            <w:tcMar>
+              <w:top w:type="dxa" w:w="40"/>
+              <w:left w:type="dxa" w:w="80"/>
+              <w:bottom w:type="dxa" w:w="40"/>
+              <w:right w:type="dxa" w:w="80"/>
+            </w:tcMar>
+          </w:tcPr>
+          <w:p>
+            <w:pPr>
+              <w:jc w:val="center"/>
+            </w:pPr>
+            <w:r>
+              <w:rPr>
+                <w:rFonts w:ascii="Times New Roman" w:cs="Times New Roman" w:eastAsia="Times New Roman" w:hAnsi="Times New Roman"/>
+                <w:b w:val="false"/>
+                <w:bCs w:val="false"/>
+                <w:sz w:val="18"/>
+                <w:szCs w:val="18"/>
+              </w:rPr>
+              <w:t xml:space="preserve">0.01</w:t>
+            </w:r>
+          </w:p>
+        </w:tc>
+        <w:tc>
+          <w:tcPr>
+            <w:tcW w:type="dxa" w:w="1200"/>
+            <w:tcBorders>
+              <w:top w:val="single" w:color="AAAAAA" w:sz="4"/>
+              <w:left w:val="single" w:color="AAAAAA" w:sz="4"/>
+              <w:bottom w:val="single" w:color="AAAAAA" w:sz="4"/>
+              <w:right w:val="single" w:color="AAAAAA" w:sz="4"/>
+            </w:tcBorders>
+            <w:tcMar>
+              <w:top w:type="dxa" w:w="40"/>
+              <w:left w:type="dxa" w:w="80"/>
+              <w:bottom w:type="dxa" w:w="40"/>
+              <w:right w:type="dxa" w:w="80"/>
+            </w:tcMar>
+          </w:tcPr>
+          <w:p>
+            <w:pPr>
+              <w:jc w:val="center"/>
+            </w:pPr>
+            <w:r>
+              <w:rPr>
+                <w:rFonts w:ascii="Times New Roman" w:cs="Times New Roman" w:eastAsia="Times New Roman" w:hAnsi="Times New Roman"/>
+                <w:b w:val="false"/>
+                <w:bCs w:val="false"/>
+                <w:sz w:val="18"/>
+                <w:szCs w:val="18"/>
+              </w:rPr>
+              <w:t xml:space="preserve">0.7</w:t>
+            </w:r>
+          </w:p>
+        </w:tc>
+        <w:tc>
+          <w:tcPr>
+            <w:tcW w:type="dxa" w:w="1200"/>
+            <w:tcBorders>
+              <w:top w:val="single" w:color="AAAAAA" w:sz="4"/>
+              <w:left w:val="single" w:color="AAAAAA" w:sz="4"/>
+              <w:bottom w:val="single" w:color="AAAAAA" w:sz="4"/>
+              <w:right w:val="single" w:color="AAAAAA" w:sz="4"/>
+            </w:tcBorders>
+            <w:tcMar>
+              <w:top w:type="dxa" w:w="40"/>
+              <w:left w:type="dxa" w:w="80"/>
+              <w:bottom w:type="dxa" w:w="40"/>
+              <w:right w:type="dxa" w:w="80"/>
+            </w:tcMar>
+          </w:tcPr>
+          <w:p>
+            <w:pPr>
+              <w:jc w:val="center"/>
+            </w:pPr>
+            <w:r>
+              <w:rPr>
+                <w:rFonts w:ascii="Times New Roman" w:cs="Times New Roman" w:eastAsia="Times New Roman" w:hAnsi="Times New Roman"/>
+                <w:b w:val="false"/>
+                <w:bCs w:val="false"/>
+                <w:sz w:val="18"/>
+                <w:szCs w:val="18"/>
+              </w:rPr>
+              <w:t xml:space="preserve">2</w:t>
+            </w:r>
+          </w:p>
+        </w:tc>
+        <w:tc>
+          <w:tcPr>
+            <w:tcW w:type="dxa" w:w="1100"/>
+            <w:tcBorders>
+              <w:top w:val="single" w:color="AAAAAA" w:sz="4"/>
+              <w:left w:val="single" w:color="AAAAAA" w:sz="4"/>
+              <w:bottom w:val="single" w:color="AAAAAA" w:sz="4"/>
+              <w:right w:val="single" w:color="AAAAAA" w:sz="4"/>
+            </w:tcBorders>
+            <w:tcMar>
+              <w:top w:type="dxa" w:w="40"/>
+              <w:left w:type="dxa" w:w="80"/>
+              <w:bottom w:type="dxa" w:w="40"/>
+              <w:right w:type="dxa" w:w="80"/>
+            </w:tcMar>
+          </w:tcPr>
+          <w:p>
+            <w:pPr>
+              <w:jc w:val="center"/>
+            </w:pPr>
+            <w:r>
+              <w:rPr>
+                <w:rFonts w:ascii="Times New Roman" w:cs="Times New Roman" w:eastAsia="Times New Roman" w:hAnsi="Times New Roman"/>
+                <w:b w:val="false"/>
+                <w:bCs w:val="false"/>
+                <w:sz w:val="18"/>
+                <w:szCs w:val="18"/>
+              </w:rPr>
+              <w:t xml:space="preserve">0</w:t>
+            </w:r>
+          </w:p>
+        </w:tc>
+        <w:tc>
+          <w:tcPr>
+            <w:tcW w:type="dxa" w:w="1160"/>
+            <w:tcBorders>
+              <w:top w:val="single" w:color="AAAAAA" w:sz="4"/>
+              <w:left w:val="single" w:color="AAAAAA" w:sz="4"/>
+              <w:bottom w:val="single" w:color="AAAAAA" w:sz="4"/>
+              <w:right w:val="single" w:color="AAAAAA" w:sz="4"/>
+            </w:tcBorders>
+            <w:tcMar>
+              <w:top w:type="dxa" w:w="40"/>
+              <w:left w:type="dxa" w:w="80"/>
+              <w:bottom w:type="dxa" w:w="40"/>
+              <w:right w:type="dxa" w:w="80"/>
+            </w:tcMar>
+          </w:tcPr>
+          <w:p>
+            <w:pPr>
+              <w:jc w:val="center"/>
+            </w:pPr>
+            <w:r>
+              <w:rPr>
+                <w:rFonts w:ascii="Times New Roman" w:cs="Times New Roman" w:eastAsia="Times New Roman" w:hAnsi="Times New Roman"/>
+                <w:b w:val="false"/>
+                <w:bCs w:val="false"/>
+                <w:sz w:val="18"/>
+                <w:szCs w:val="18"/>
+              </w:rPr>
+              <w:t xml:space="preserve">$433</w:t>
+            </w:r>
+          </w:p>
+        </w:tc>
+      </w:tr>
+      <w:tr>
+        <w:trPr>
+          <w:cantSplit/>
+        </w:trPr>
+        <w:tc>
+          <w:tcPr>
+            <w:tcW w:type="dxa" w:w="500"/>
+            <w:tcBorders>
+              <w:top w:val="single" w:color="AAAAAA" w:sz="4"/>
+              <w:left w:val="single" w:color="AAAAAA" w:sz="4"/>
+              <w:bottom w:val="single" w:color="AAAAAA" w:sz="4"/>
+              <w:right w:val="single" w:color="AAAAAA" w:sz="4"/>
+            </w:tcBorders>
+            <w:tcMar>
+              <w:top w:type="dxa" w:w="40"/>
+              <w:left w:type="dxa" w:w="80"/>
+              <w:bottom w:type="dxa" w:w="40"/>
+              <w:right w:type="dxa" w:w="80"/>
+            </w:tcMar>
+          </w:tcPr>
+          <w:p>
+            <w:pPr>
+              <w:jc w:val="center"/>
+            </w:pPr>
+            <w:r>
+              <w:rPr>
+                <w:rFonts w:ascii="Times New Roman" w:cs="Times New Roman" w:eastAsia="Times New Roman" w:hAnsi="Times New Roman"/>
+                <w:b w:val="false"/>
+                <w:bCs w:val="false"/>
+                <w:sz w:val="18"/>
+                <w:szCs w:val="18"/>
+              </w:rPr>
+              <w:t xml:space="preserve">6</w:t>
+            </w:r>
+          </w:p>
+        </w:tc>
+        <w:tc>
+          <w:tcPr>
+            <w:tcW w:type="dxa" w:w="1100"/>
+            <w:tcBorders>
+              <w:top w:val="single" w:color="AAAAAA" w:sz="4"/>
+              <w:left w:val="single" w:color="AAAAAA" w:sz="4"/>
+              <w:bottom w:val="single" w:color="AAAAAA" w:sz="4"/>
+              <w:right w:val="single" w:color="AAAAAA" w:sz="4"/>
+            </w:tcBorders>
+            <w:tcMar>
+              <w:top w:type="dxa" w:w="40"/>
+              <w:left w:type="dxa" w:w="80"/>
+              <w:bottom w:type="dxa" w:w="40"/>
+              <w:right w:type="dxa" w:w="80"/>
+            </w:tcMar>
+          </w:tcPr>
+          <w:p>
+            <w:pPr>
+              <w:jc w:val="center"/>
+            </w:pPr>
+            <w:r>
+              <w:rPr>
+                <w:rFonts w:ascii="Times New Roman" w:cs="Times New Roman" w:eastAsia="Times New Roman" w:hAnsi="Times New Roman"/>
+                <w:b w:val="false"/>
+                <w:bCs w:val="false"/>
+                <w:sz w:val="18"/>
+                <w:szCs w:val="18"/>
+              </w:rPr>
+              <w:t xml:space="preserve">0.3</w:t>
+            </w:r>
+          </w:p>
+        </w:tc>
+        <w:tc>
+          <w:tcPr>
+            <w:tcW w:type="dxa" w:w="1100"/>
+            <w:tcBorders>
+              <w:top w:val="single" w:color="AAAAAA" w:sz="4"/>
+              <w:left w:val="single" w:color="AAAAAA" w:sz="4"/>
+              <w:bottom w:val="single" w:color="AAAAAA" w:sz="4"/>
+              <w:right w:val="single" w:color="AAAAAA" w:sz="4"/>
+            </w:tcBorders>
+            <w:tcMar>
+              <w:top w:type="dxa" w:w="40"/>
+              <w:left w:type="dxa" w:w="80"/>
+              <w:bottom w:type="dxa" w:w="40"/>
+              <w:right w:type="dxa" w:w="80"/>
+            </w:tcMar>
+          </w:tcPr>
+          <w:p>
+            <w:pPr>
+              <w:jc w:val="center"/>
+            </w:pPr>
+            <w:r>
+              <w:rPr>
+                <w:rFonts w:ascii="Times New Roman" w:cs="Times New Roman" w:eastAsia="Times New Roman" w:hAnsi="Times New Roman"/>
+                <w:b w:val="false"/>
+                <w:bCs w:val="false"/>
+                <w:sz w:val="18"/>
+                <w:szCs w:val="18"/>
+              </w:rPr>
+              <w:t xml:space="preserve">0.03%</w:t>
+            </w:r>
+          </w:p>
+        </w:tc>
+        <w:tc>
+          <w:tcPr>
+            <w:tcW w:type="dxa" w:w="1100"/>
+            <w:tcBorders>
+              <w:top w:val="single" w:color="AAAAAA" w:sz="4"/>
+              <w:left w:val="single" w:color="AAAAAA" w:sz="4"/>
+              <w:bottom w:val="single" w:color="AAAAAA" w:sz="4"/>
+              <w:right w:val="single" w:color="AAAAAA" w:sz="4"/>
+            </w:tcBorders>
+            <w:tcMar>
+              <w:top w:type="dxa" w:w="40"/>
+              <w:left w:type="dxa" w:w="80"/>
+              <w:bottom w:type="dxa" w:w="40"/>
+              <w:right w:type="dxa" w:w="80"/>
+            </w:tcMar>
+          </w:tcPr>
+          <w:p>
+            <w:pPr>
+              <w:jc w:val="center"/>
+            </w:pPr>
+            <w:r>
+              <w:rPr>
+                <w:rFonts w:ascii="Times New Roman" w:cs="Times New Roman" w:eastAsia="Times New Roman" w:hAnsi="Times New Roman"/>
+                <w:b w:val="false"/>
+                <w:bCs w:val="false"/>
+                <w:sz w:val="18"/>
+                <w:szCs w:val="18"/>
+              </w:rPr>
+              <w:t xml:space="preserve">0.01</w:t>
+            </w:r>
+          </w:p>
+        </w:tc>
+        <w:tc>
+          <w:tcPr>
+            <w:tcW w:type="dxa" w:w="1100"/>
+            <w:tcBorders>
+              <w:top w:val="single" w:color="AAAAAA" w:sz="4"/>
+              <w:left w:val="single" w:color="AAAAAA" w:sz="4"/>
+              <w:bottom w:val="single" w:color="AAAAAA" w:sz="4"/>
+              <w:right w:val="single" w:color="AAAAAA" w:sz="4"/>
+            </w:tcBorders>
+            <w:tcMar>
+              <w:top w:type="dxa" w:w="40"/>
+              <w:left w:type="dxa" w:w="80"/>
+              <w:bottom w:type="dxa" w:w="40"/>
+              <w:right w:type="dxa" w:w="80"/>
+            </w:tcMar>
+          </w:tcPr>
+          <w:p>
+            <w:pPr>
+              <w:jc w:val="center"/>
+            </w:pPr>
+            <w:r>
+              <w:rPr>
+                <w:rFonts w:ascii="Times New Roman" w:cs="Times New Roman" w:eastAsia="Times New Roman" w:hAnsi="Times New Roman"/>
+                <w:b w:val="false"/>
+                <w:bCs w:val="false"/>
+                <w:sz w:val="18"/>
+                <w:szCs w:val="18"/>
+              </w:rPr>
+              <w:t xml:space="preserve">0.00</w:t>
+            </w:r>
+          </w:p>
+        </w:tc>
+        <w:tc>
+          <w:tcPr>
+            <w:tcW w:type="dxa" w:w="1200"/>
+            <w:tcBorders>
+              <w:top w:val="single" w:color="AAAAAA" w:sz="4"/>
+              <w:left w:val="single" w:color="AAAAAA" w:sz="4"/>
+              <w:bottom w:val="single" w:color="AAAAAA" w:sz="4"/>
+              <w:right w:val="single" w:color="AAAAAA" w:sz="4"/>
+            </w:tcBorders>
+            <w:tcMar>
+              <w:top w:type="dxa" w:w="40"/>
+              <w:left w:type="dxa" w:w="80"/>
+              <w:bottom w:type="dxa" w:w="40"/>
+              <w:right w:type="dxa" w:w="80"/>
+            </w:tcMar>
+          </w:tcPr>
+          <w:p>
+            <w:pPr>
+              <w:jc w:val="center"/>
+            </w:pPr>
+            <w:r>
+              <w:rPr>
+                <w:rFonts w:ascii="Times New Roman" w:cs="Times New Roman" w:eastAsia="Times New Roman" w:hAnsi="Times New Roman"/>
+                <w:b w:val="false"/>
+                <w:bCs w:val="false"/>
+                <w:sz w:val="18"/>
+                <w:szCs w:val="18"/>
+              </w:rPr>
+              <w:t xml:space="preserve">0.3</w:t>
+            </w:r>
+          </w:p>
+        </w:tc>
+        <w:tc>
+          <w:tcPr>
+            <w:tcW w:type="dxa" w:w="1200"/>
+            <w:tcBorders>
+              <w:top w:val="single" w:color="AAAAAA" w:sz="4"/>
+              <w:left w:val="single" w:color="AAAAAA" w:sz="4"/>
+              <w:bottom w:val="single" w:color="AAAAAA" w:sz="4"/>
+              <w:right w:val="single" w:color="AAAAAA" w:sz="4"/>
+            </w:tcBorders>
+            <w:tcMar>
+              <w:top w:type="dxa" w:w="40"/>
+              <w:left w:type="dxa" w:w="80"/>
+              <w:bottom w:type="dxa" w:w="40"/>
+              <w:right w:type="dxa" w:w="80"/>
+            </w:tcMar>
+          </w:tcPr>
+          <w:p>
+            <w:pPr>
+              <w:jc w:val="center"/>
+            </w:pPr>
+            <w:r>
+              <w:rPr>
+                <w:rFonts w:ascii="Times New Roman" w:cs="Times New Roman" w:eastAsia="Times New Roman" w:hAnsi="Times New Roman"/>
+                <w:b w:val="false"/>
+                <w:bCs w:val="false"/>
+                <w:sz w:val="18"/>
+                <w:szCs w:val="18"/>
+              </w:rPr>
+              <w:t xml:space="preserve">1</w:t>
+            </w:r>
+          </w:p>
+        </w:tc>
+        <w:tc>
+          <w:tcPr>
+            <w:tcW w:type="dxa" w:w="1100"/>
+            <w:tcBorders>
+              <w:top w:val="single" w:color="AAAAAA" w:sz="4"/>
+              <w:left w:val="single" w:color="AAAAAA" w:sz="4"/>
+              <w:bottom w:val="single" w:color="AAAAAA" w:sz="4"/>
+              <w:right w:val="single" w:color="AAAAAA" w:sz="4"/>
+            </w:tcBorders>
+            <w:tcMar>
+              <w:top w:type="dxa" w:w="40"/>
+              <w:left w:type="dxa" w:w="80"/>
+              <w:bottom w:type="dxa" w:w="40"/>
+              <w:right w:type="dxa" w:w="80"/>
+            </w:tcMar>
+          </w:tcPr>
+          <w:p>
+            <w:pPr>
+              <w:jc w:val="center"/>
+            </w:pPr>
+            <w:r>
+              <w:rPr>
+                <w:rFonts w:ascii="Times New Roman" w:cs="Times New Roman" w:eastAsia="Times New Roman" w:hAnsi="Times New Roman"/>
+                <w:b w:val="false"/>
+                <w:bCs w:val="false"/>
+                <w:sz w:val="18"/>
+                <w:szCs w:val="18"/>
+              </w:rPr>
+              <w:t xml:space="preserve">0</w:t>
+            </w:r>
+          </w:p>
+        </w:tc>
+        <w:tc>
+          <w:tcPr>
+            <w:tcW w:type="dxa" w:w="1160"/>
+            <w:tcBorders>
+              <w:top w:val="single" w:color="AAAAAA" w:sz="4"/>
+              <w:left w:val="single" w:color="AAAAAA" w:sz="4"/>
+              <w:bottom w:val="single" w:color="AAAAAA" w:sz="4"/>
+              <w:right w:val="single" w:color="AAAAAA" w:sz="4"/>
+            </w:tcBorders>
+            <w:tcMar>
+              <w:top w:type="dxa" w:w="40"/>
+              <w:left w:type="dxa" w:w="80"/>
+              <w:bottom w:type="dxa" w:w="40"/>
+              <w:right w:type="dxa" w:w="80"/>
+            </w:tcMar>
+          </w:tcPr>
+          <w:p>
+            <w:pPr>
+              <w:jc w:val="center"/>
+            </w:pPr>
+            <w:r>
+              <w:rPr>
+                <w:rFonts w:ascii="Times New Roman" w:cs="Times New Roman" w:eastAsia="Times New Roman" w:hAnsi="Times New Roman"/>
+                <w:b w:val="false"/>
+                <w:bCs w:val="false"/>
+                <w:sz w:val="18"/>
+                <w:szCs w:val="18"/>
+              </w:rPr>
+              <w:t xml:space="preserve">$1169</w:t>
+            </w:r>
+          </w:p>
+        </w:tc>
+      </w:tr>
+    </w:tbl>
+    <w:p>
+      <w:pPr>
+        <w:spacing w:after="240" w:before="60" w:line="240"/>
+      </w:pPr>
+      <w:r>
+        <w:rPr>
+          <w:rFonts w:ascii="Times New Roman" w:cs="Times New Roman" w:eastAsia="Times New Roman" w:hAnsi="Times New Roman"/>
+          <w:i/>
+          <w:iCs/>
+          <w:sz w:val="18"/>
+          <w:szCs w:val="18"/>
+        </w:rPr>
+        <w:t xml:space="preserve">Illustrative parameters; computed by econ_tables.py. Attention is e* = min{1, rρ/ψ}; events handled are e*λ_N; undetected errors are (1 − e*)λ_N. The reward for full attention is ψ/ρ, and its expected payment is ψM = $300 per day at every depth.</w:t>
+      </w:r>
+    </w:p>
+    <w:p>
+      <w:pPr>
+        <w:spacing w:after="0" w:line="480"/>
+        <w:ind w:firstLine="720"/>
+        <w:jc w:val="left"/>
+      </w:pPr>
+      <w:r>
+        <w:rPr>
+          <w:rFonts w:ascii="Times New Roman" w:cs="Times New Roman" w:eastAsia="Times New Roman" w:hAnsi="Times New Roman"/>
+          <w:sz w:val="24"/>
+          <w:szCs w:val="24"/>
+        </w:rPr>
+        <w:t xml:space="preserve">Part (c) says what it takes to restore vigilance. At three layers the reward needed for full attention is $59 per error found instead of $3 without screening, and at four layers it is $160, although the daily payment stays at $300. The firm can therefore sustain attention by paying more per error, by paying a flat amount for review, which is what the constant daily payment amounts to, or by raising prevalence in what the reviewer sees. Part (d) is the last route and corresponds to the gate-and-review architecture of Section 2.6. For a gate that sends 20% of items to review and holds 70% of the errors, s²/γ = 2.45, and at three layers the errors found rise from 0.64 to 1.57 per day. An uninformative gate, with s = γ, lowers detection. The gate thus has a second benefit that the capacity model alone does not show: besides lowering the review volume, it concentrates the errors in the cases people see, which keeps their attention worth its cost.</w:t>
       </w:r>
     </w:p>
     <w:p>
@@ -20224,6 +22778,21 @@
     </w:p>
     <w:p>
       <w:pPr>
+        <w:spacing w:after="0" w:line="480"/>
+        <w:ind w:firstLine="720"/>
+        <w:jc w:val="left"/>
+      </w:pPr>
+      <w:r>
+        <w:rPr>
+          <w:rFonts w:ascii="Times New Roman" w:cs="Times New Roman" w:eastAsia="Times New Roman" w:hAnsi="Times New Roman"/>
+          <w:sz w:val="24"/>
+          <w:szCs w:val="24"/>
+        </w:rPr>
+        <w:t xml:space="preserve">The extension of Section 3.8 shows that the assumption of full detection is not innocuous. When detection depends on reviewers whose attention is private, screening and vigilance are substitutes in effect: the layers that remove errors also make errors rarer among the items a person inspects, and a reviewer who is paid per error found has less reason to look hard. In the illustration of Table E4, a three-layer cascade removes about 95% of the surviving errors but the number of incidents handled falls by more than 99%, because attention falls from complete to about one in eight. The firm that watches handled incidents, or plans to maintain the status quo while the dashboard improves, mistakes lost detection for success. This is moral hazard in the textbook sense, with an unobservable action and an outcome that is only partly informative about it (Holmström 1979), and it matches the human-factors finding that reliance on automation erodes attention to the cases it passes (Parasuraman and Manzey 2010). Two remedies follow from Proposition 8: rewards or flat pay that do not depend on how often errors occur, and gates that raise the prevalence of errors in the cases people see. The second is the structure of the gate-and-review systems described in Section 2.6.</w:t>
+      </w:r>
+    </w:p>
+    <w:p>
+      <w:pPr>
         <w:pStyle w:val="Heading2"/>
         <w:keepNext/>
         <w:spacing w:after="60" w:before="240" w:line="360"/>
@@ -20254,7 +22823,7 @@
           <w:sz w:val="24"/>
           <w:szCs w:val="24"/>
         </w:rPr>
-        <w:t xml:space="preserve">For managers, the practical sequence follows from the model. Estimate the dispersion of incident counts before fixing a staffing plan, since a coefficient of variation of the daily rate of 0.3 to 0.44 was enough for a Poisson-sized plan to be exceeded on 23 to 28% to 30 to 32% of days without guardrails and 7 to 16% of days with the best cascade, against a 5% target. State the shortfall cost that the service-level target implies and check that it is plausible. Evaluate each guardrail layer by its marginal effect on required capacity net of its false rejections, latency and failures, and measure the dependence between layers before crediting a stack with its nominal effectiveness. In our data one verifier delivered most of the benefit, the deterministic layer was nearly inert, and the routed judge's saving was indistinguishable from zero (paired intervals for the daily saving $429 [-$5, $931]; -$2 [-$5, $0]; $61 [-$9, $646]) at about three times the latency. Failure classes should be modelled separately and pooled at the ticket level: in our illustrative organisation a typed superposition required 14 to 48% more daily capacity than a single Poisson on the total, though this gap depends on assumed dispersion and is not a validated gain.</w:t>
+        <w:t xml:space="preserve">For managers, the practical sequence follows from the model. Estimate the dispersion of incident counts before fixing a staffing plan, since a coefficient of variation of the daily rate of 0.3 to 0.44 was enough for a Poisson-sized plan to be exceeded on 23 to 28% to 30 to 32% of days without guardrails and 7 to 16% of days with the best cascade, against a 5% target. State the shortfall cost that the service-level target implies and check that it is plausible. Evaluate each guardrail layer by its marginal effect on required capacity net of its false rejections, latency and failures, and measure the dependence between layers before crediting a stack with its nominal effectiveness. In our data one verifier delivered most of the benefit, the deterministic layer was nearly inert, and the routed judge's saving was indistinguishable from zero (paired intervals for the daily saving $429 [-$5, $931]; -$2 [-$5, $0]; $61 [-$9, $646]) at about three times the latency. Do not read a falling count of handled incidents as proof that screening works, because part of the fall is lost detection (Table E4); audit a sample of unflagged items to measure what is missed. Where risk can be estimated before generation, as in the pre-generation scoring that J.P. Morgan researchers describe (Watson et al. 2024), send the riskiest cases to people, since a gate with s² &gt; γ raises both detection and the value of each reviewer's attention (Proposition 8). Failure classes should be modelled separately and pooled at the ticket level: in our illustrative organisation a typed superposition required 14 to 48% more daily capacity than a single Poisson on the total, though this gap depends on assumed dispersion and is not a validated gain.</w:t>
       </w:r>
     </w:p>
     <w:p>
@@ -20304,7 +22873,7 @@
           <w:sz w:val="24"/>
           <w:szCs w:val="24"/>
         </w:rPr>
-        <w:t xml:space="preserve">The economic content of the model is also limited. It is a partial-equilibrium, single-firm cost-minimisation problem and not a welfare analysis: the shortfall cost, the false-block cost and the residual-harm cost are scenario parameters, user harms and external effects are compressed into unit costs, and demand does not respond to quality or price. There are no strategic actors, so the model omits both the moral hazard of reviewers who rely on guardrails and the adaptation of adversaries to known screens. Detection is assumed complete, which sets aside an information problem that is itself a source of cost. These are natural extensions, and each would change the quantitative conclusions.</w:t>
+        <w:t xml:space="preserve">The economic content of the model is also limited. It is a partial-equilibrium, single-firm cost-minimisation problem and not a welfare analysis: the shortfall cost, the false-block cost and the residual-harm cost are scenario parameters, user harms and external effects are compressed into unit costs, and demand does not respond to quality or price. Reviewer behaviour is modelled in the simplest way (Section 3.8): a single attention choice with quadratic cost, a linear reward and no observability of missed errors, and the parameters of Table E4 are illustrative and not estimated. We have no data on reviewer attention, so the vigilance result is a theoretical prediction that remains to be tested. Other strategic actors are absent, so the model omits the adaptation of adversaries to known screens. Outside Section 3.8, detection is assumed complete. These are natural extensions, and each would change the quantitative conclusions.</w:t>
       </w:r>
     </w:p>
     <w:p>
@@ -20397,7 +22966,7 @@
           <w:sz w:val="24"/>
           <w:szCs w:val="24"/>
         </w:rPr>
-        <w:t xml:space="preserve">Human backup for machine errors is a safety stock, and screening is the capital that economises on it. Under the stated assumptions the standby workforce should be a quantile of the daily incident count, with the service level implied by the cost of a shortfall; over-dispersion raises the required safety stock beyond what a Poisson model or the dispersion index suggests; the independence formula for stacked screens overstates diversification and understates residual risk; a single Poisson on all failures misdescribes every class; and with indivisible capacity and a floor on standing staff, the cost-minimising depth of screening is not fixed at three and responds to the relative prices of labour and compute.</w:t>
+        <w:t xml:space="preserve">Human backup for machine errors is a safety stock, and screening is the capital that economises on it. Under the stated assumptions the standby workforce should be a quantile of the daily incident count, with the service level implied by the cost of a shortfall; over-dispersion raises the required safety stock beyond what a Poisson model or the dispersion index suggests; the independence formula for stacked screens overstates diversification and understates residual risk; a single Poisson on all failures misdescribes every class; and with indivisible capacity and a floor on standing staff, the cost-minimising depth of screening is not fixed at three and responds to the relative prices of labour and compute. Because screening lowers the prevalence of errors that reviewers see, it also erodes their vigilance, so a falling count of handled incidents overstates success unless rewards or gates restore attention.</w:t>
       </w:r>
     </w:p>
     <w:p>
@@ -20771,6 +23340,20 @@
           <w:sz w:val="22"/>
           <w:szCs w:val="22"/>
         </w:rPr>
+        <w:t xml:space="preserve">Holmström, B. 1979. "Moral Hazard and Observability," Bell Journal of Economics (10:1), pp. 74-91.</w:t>
+      </w:r>
+    </w:p>
+    <w:p>
+      <w:pPr>
+        <w:spacing w:after="100" w:line="276"/>
+        <w:ind w:left="720" w:hanging="720"/>
+      </w:pPr>
+      <w:r>
+        <w:rPr>
+          <w:rFonts w:ascii="Times New Roman" w:cs="Times New Roman" w:eastAsia="Times New Roman" w:hAnsi="Times New Roman"/>
+          <w:sz w:val="22"/>
+          <w:szCs w:val="22"/>
+        </w:rPr>
         <w:t xml:space="preserve">Inan, H., Upasani, K., Chi, J., Rungta, R., Iyer, K., Mao, Y., Tontchev, M., Hu, Q., Fuller, B., Testuggine, D., and Khabsa, M. 2023. "Llama Guard: LLM-Based Input-Output Safeguard for Human-AI Conversations," arXiv:2312.06674.</w:t>
       </w:r>
     </w:p>
@@ -20869,6 +23452,34 @@
           <w:sz w:val="22"/>
           <w:szCs w:val="22"/>
         </w:rPr>
+        <w:t xml:space="preserve">Parasuraman, R., and Manzey, D. H. 2010. "Complacency and Bias in Human Use of Automation: An Attentional Integration," Human Factors (52:3), pp. 381-410.</w:t>
+      </w:r>
+    </w:p>
+    <w:p>
+      <w:pPr>
+        <w:spacing w:after="100" w:line="276"/>
+        <w:ind w:left="720" w:hanging="720"/>
+      </w:pPr>
+      <w:r>
+        <w:rPr>
+          <w:rFonts w:ascii="Times New Roman" w:cs="Times New Roman" w:eastAsia="Times New Roman" w:hAnsi="Times New Roman"/>
+          <w:sz w:val="22"/>
+          <w:szCs w:val="22"/>
+        </w:rPr>
+        <w:t xml:space="preserve">PatSnap. n.d. "How to Evaluate Hallucination Rate in Large Language Models for High-Stakes Engineering Decision Support" (https://www.patsnap.com/resources/blog/articles/llm-hallucination-rate-evaluation-for-engineering/; accessed October 6, 2026).</w:t>
+      </w:r>
+    </w:p>
+    <w:p>
+      <w:pPr>
+        <w:spacing w:after="100" w:line="276"/>
+        <w:ind w:left="720" w:hanging="720"/>
+      </w:pPr>
+      <w:r>
+        <w:rPr>
+          <w:rFonts w:ascii="Times New Roman" w:cs="Times New Roman" w:eastAsia="Times New Roman" w:hAnsi="Times New Roman"/>
+          <w:sz w:val="22"/>
+          <w:szCs w:val="22"/>
+        </w:rPr>
         <w:t xml:space="preserve">Porteus, E. L. 2002. Foundations of Stochastic Inventory Theory. Stanford, CA: Stanford University Press.</w:t>
       </w:r>
     </w:p>
@@ -20953,6 +23564,20 @@
           <w:sz w:val="22"/>
           <w:szCs w:val="22"/>
         </w:rPr>
+        <w:t xml:space="preserve">US 2024/0330824 A1. 2024. "Determining Machine Learning Model Anomalies and Impact on Business Output Data," JPMorgan Chase Bank, N.A. (filed March 31, 2023; published October 3, 2024).</w:t>
+      </w:r>
+    </w:p>
+    <w:p>
+      <w:pPr>
+        <w:spacing w:after="100" w:line="276"/>
+        <w:ind w:left="720" w:hanging="720"/>
+      </w:pPr>
+      <w:r>
+        <w:rPr>
+          <w:rFonts w:ascii="Times New Roman" w:cs="Times New Roman" w:eastAsia="Times New Roman" w:hAnsi="Times New Roman"/>
+          <w:sz w:val="22"/>
+          <w:szCs w:val="22"/>
+        </w:rPr>
         <w:t xml:space="preserve">Verenich, I. 2016. "Helpdesk" (help desk log of an Italian software company), Mendeley Data, V1 (https://doi.org/10.17632/39bp3vv62t.1).</w:t>
       </w:r>
     </w:p>
@@ -20968,6 +23593,20 @@
           <w:szCs w:val="22"/>
         </w:rPr>
         <w:t xml:space="preserve">Wang, Y., Chen, Y., Li, Z., Kang, X., Fang, Y., Zhou, Y., Zheng, Y., Tang, Z., He, X., Guo, R., Wang, X., Wang, Q., Zhou, A. C., and Chu, X. 2025. "BurstGPT: A Real-World Workload Dataset to Optimize LLM Serving Systems," in Proceedings of KDD 2025 (arXiv:2401.17644).</w:t>
+      </w:r>
+    </w:p>
+    <w:p>
+      <w:pPr>
+        <w:spacing w:after="100" w:line="276"/>
+        <w:ind w:left="720" w:hanging="720"/>
+      </w:pPr>
+      <w:r>
+        <w:rPr>
+          <w:rFonts w:ascii="Times New Roman" w:cs="Times New Roman" w:eastAsia="Times New Roman" w:hAnsi="Times New Roman"/>
+          <w:sz w:val="22"/>
+          <w:szCs w:val="22"/>
+        </w:rPr>
+        <w:t xml:space="preserve">Watson, W., Cho, N., and Srishankar, N. 2024. "Is There No Such Thing as a Bad Question? H4R: HalluciBot for Ratiocination, Rewriting, Ranking, and Routing," arXiv:2404.12535.</w:t>
       </w:r>
     </w:p>
     <w:p>
@@ -21194,6 +23833,67 @@
           <w:szCs w:val="24"/>
         </w:rPr>
         <w:t xml:space="preserve"> (a) For integer k, E[(X − k − 1)⁺] − E[(X − k)⁺] = −P(X &gt; k), so Φ(k + 1) − Φ(k) = C_h − C_uP(X &gt; k). The right-hand side is non-decreasing in k, so Φ is convex, and the smallest minimiser is the smallest k with P(X &gt; k) ≤ C_h/C_u, that is, P(X ≤ k) ≥ 1 − C_h/C_u. Setting α = 1 − C_h/C_u gives C_u = C_h/(1 − α). (b) If C_u ≤ C_h then Φ(1) − Φ(0) = C_h − C_uP(X &gt; 0) ≥ C_h − C_u ≥ 0, and convexity gives k° = 0. (c) By Proposition 2(b) the stop-loss transform of the mixed-Poisson count is at least that of the Poisson count at every k, so a firm that uses the Poisson model underestimates the shortfall term of Φ at every capacity and, because the marginal benefit of capacity C_uP(X &gt; k) is perceived to be lower where the tail is lighter, tends to choose a smaller k; Table E1 reports the resulting cost. (d) Φ°(C_h) = min_k [C_hk + C_uE(X − k)⁺] is a minimum of functions linear in C_h, hence concave, and by the envelope theorem its derivative at a point where the minimiser is unique equals that minimiser. ∎</w:t>
+      </w:r>
+    </w:p>
+    <w:p>
+      <w:pPr>
+        <w:spacing w:after="0" w:line="480"/>
+        <w:ind w:firstLine="0"/>
+        <w:jc w:val="left"/>
+      </w:pPr>
+      <w:r>
+        <w:rPr>
+          <w:rFonts w:ascii="Times New Roman" w:cs="Times New Roman" w:eastAsia="Times New Roman" w:hAnsi="Times New Roman"/>
+          <w:b/>
+          <w:bCs/>
+          <w:sz w:val="24"/>
+          <w:szCs w:val="24"/>
+        </w:rPr>
+        <w:t xml:space="preserve">Proof of Proposition 8.</w:t>
+      </w:r>
+      <w:r>
+        <w:rPr>
+          <w:rFonts w:ascii="Times New Roman" w:cs="Times New Roman" w:eastAsia="Times New Roman" w:hAnsi="Times New Roman"/>
+          <w:sz w:val="24"/>
+          <w:szCs w:val="24"/>
+        </w:rPr>
+        <w:t xml:space="preserve"> (a) On one item the reviewer maximises r·e·1{error} − ψe²/2 in expectation, that is, rρe − ψe²/2 over e ∈ [0, 1], which is strictly concave with maximiser e</w:t>
+      </w:r>
+      <w:r>
+        <w:rPr>
+          <w:rFonts w:ascii="Times New Roman" w:cs="Times New Roman" w:eastAsia="Times New Roman" w:hAnsi="Times New Roman"/>
+          <w:i/>
+          <w:iCs/>
+          <w:sz w:val="24"/>
+          <w:szCs w:val="24"/>
+        </w:rPr>
+        <w:t xml:space="preserve"> = min{1, rρ/ψ}. (b) Monotonicity in ρ is immediate, and ρ = λ_N/M falls as layers are added. In the interior region e</w:t>
+      </w:r>
+      <w:r>
+        <w:rPr>
+          <w:rFonts w:ascii="Times New Roman" w:cs="Times New Roman" w:eastAsia="Times New Roman" w:hAnsi="Times New Roman"/>
+          <w:sz w:val="24"/>
+          <w:szCs w:val="24"/>
+        </w:rPr>
+        <w:t xml:space="preserve">λ_N = rλ_N²/(ψM). (c) e</w:t>
+      </w:r>
+      <w:r>
+        <w:rPr>
+          <w:rFonts w:ascii="Times New Roman" w:cs="Times New Roman" w:eastAsia="Times New Roman" w:hAnsi="Times New Roman"/>
+          <w:i/>
+          <w:iCs/>
+          <w:sz w:val="24"/>
+          <w:szCs w:val="24"/>
+        </w:rPr>
+        <w:t xml:space="preserve"> = 1 requires rρ ≥ ψ, and then the expected payment per day is r·ρM·1 = (ψ/ρ)ρM = ψM at the smallest such reward, independent of ρ. (d) Without the gate the expected number of errors found is λ_N·e</w:t>
+      </w:r>
+      <w:r>
+        <w:rPr>
+          <w:rFonts w:ascii="Times New Roman" w:cs="Times New Roman" w:eastAsia="Times New Roman" w:hAnsi="Times New Roman"/>
+          <w:sz w:val="24"/>
+          <w:szCs w:val="24"/>
+        </w:rPr>
+        <w:t xml:space="preserve">, with e* = rρ/ψ in the interior. With the gate the reviewed set has γM items and sλ_N errors, so prevalence is ρ' = sλ_N/(γM), attention is e' = rρ'/ψ and the expected number found is sλ_N·e' = rs²λ_N²/(γMψ). The ratio of the two is s²/γ, which exceeds one if and only if s² &gt; γ. ∎</w:t>
       </w:r>
     </w:p>
     <w:p>

</xml_diff>

<commit_message>
Economics manuscript: drop reliance on unpublished JPMorgan patents; cite only public sources (HalluciBot, US 2024/0330824 A1)
Co-Authored-By: Claude Sonnet 5.5 <noreply@anthropic.com>
Claude-Session: https://claude.ai/code/session_01FJoEQKBVMu4pDX4YuJC5vW
</commit_message>
<xml_diff>
--- a/hallucination_poisson/paper/ECON_Manuscript.docx
+++ b/hallucination_poisson/paper/ECON_Manuscript.docx
@@ -441,7 +441,7 @@
           <w:sz w:val="24"/>
           <w:szCs w:val="24"/>
         </w:rPr>
-        <w:t xml:space="preserve">Industry practice already combines automated screening with human review. Researchers at J.P. Morgan propose HalluciBot, a model that estimates a query's propensity to hallucinate before any generation, by perturbing the query, sampling outputs from several agents and running a Monte Carlo simulation to obtain an empirical hallucination rate that supervises an encoder classifier (Watson et al. 2024). Patent-analytics summaries report two filings by the same assignee on pre-generation hallucination probability, which describe using a risk threshold to decide whether a query proceeds to the model or goes to a human expert (PatSnap n.d.); we could not obtain the full texts of those filings and cite them only as reported. A separate J.P. Morgan application describes monitoring model outputs, such as fraud scores, approval decisions and transaction counts, against the same window in earlier days or weeks and alerting an operator when they deviate (US 2024/0330824 A1). We cite these as illustrations of a gate-and-review architecture and of baseline monitoring. None of the documents we read describes hallucinations as a Poisson process or proposes to stop reducing them. They estimate risk, route risky cases to people and watch for drift, which is the structure that Sections 3.7 and 3.8 formalise.</w:t>
+        <w:t xml:space="preserve">Industry practice already puts a risk estimate ahead of generation and a monitor behind it. Researchers at J.P. Morgan propose HalluciBot, a model that estimates a query's propensity to hallucinate before any generation, by perturbing the query, sampling outputs from several agents and running a Monte Carlo simulation to obtain an empirical hallucination rate that supervises an encoder classifier; the estimate is then used to rewrite, rank and route queries (Watson et al. 2024). A separate J.P. Morgan patent application describes monitoring model outputs, such as fraud scores, approval decisions and transaction counts, against the same window in earlier days or weeks and alerting an operator when they deviate (US 2024/0330824 A1). We cite these as illustrations of pre-generation gating and of baseline monitoring. Neither document describes hallucinations as a Poisson process or proposes to stop reducing them: they estimate risk before generation, route cases accordingly and watch for drift, which is the structure that Sections 3.7 and 3.8 formalise. Industry sources mention further filings by the same firm on pre-generation hallucination probability, but we could not find them in public patent records and we do not rely on them.</w:t>
       </w:r>
     </w:p>
     <w:p>
@@ -14085,7 +14085,7 @@
           <w:sz w:val="24"/>
           <w:szCs w:val="24"/>
         </w:rPr>
-        <w:t xml:space="preserve">Part (c) says what it takes to restore vigilance. At three layers the reward needed for full attention is $59 per error found instead of $3 without screening, and at four layers it is $160, although the daily payment stays at $300. The firm can therefore sustain attention by paying more per error, by paying a flat amount for review, which is what the constant daily payment amounts to, or by raising prevalence in what the reviewer sees. Part (d) is the last route and corresponds to the gate-and-review architecture of Section 2.6. For a gate that sends 20% of items to review and holds 70% of the errors, s²/γ = 2.45, and at three layers the errors found rise from 0.64 to 1.57 per day. An uninformative gate, with s = γ, lowers detection. The gate thus has a second benefit that the capacity model alone does not show: besides lowering the review volume, it concentrates the errors in the cases people see, which keeps their attention worth its cost.</w:t>
+        <w:t xml:space="preserve">Part (c) says what it takes to restore vigilance. At three layers the reward needed for full attention is $59 per error found instead of $3 without screening, and at four layers it is $160, although the daily payment stays at $300. The firm can therefore sustain attention by paying more per error, by paying a flat amount for review, which is what the constant daily payment amounts to, or by raising prevalence in what the reviewer sees. Part (d) is the last route and corresponds to the pre-generation gating described in Section 2.6. For a gate that sends 20% of items to review and holds 70% of the errors, s²/γ = 2.45, and at three layers the errors found rise from 0.64 to 1.57 per day. An uninformative gate, with s = γ, lowers detection. The gate thus has a second benefit that the capacity model alone does not show: besides lowering the review volume, it concentrates the errors in the cases people see, which keeps their attention worth its cost.</w:t>
       </w:r>
     </w:p>
     <w:p>
@@ -22788,7 +22788,7 @@
           <w:sz w:val="24"/>
           <w:szCs w:val="24"/>
         </w:rPr>
-        <w:t xml:space="preserve">The extension of Section 3.8 shows that the assumption of full detection is not innocuous. When detection depends on reviewers whose attention is private, screening and vigilance are substitutes in effect: the layers that remove errors also make errors rarer among the items a person inspects, and a reviewer who is paid per error found has less reason to look hard. In the illustration of Table E4, a three-layer cascade removes about 95% of the surviving errors but the number of incidents handled falls by more than 99%, because attention falls from complete to about one in eight. The firm that watches handled incidents, or plans to maintain the status quo while the dashboard improves, mistakes lost detection for success. This is moral hazard in the textbook sense, with an unobservable action and an outcome that is only partly informative about it (Holmström 1979), and it matches the human-factors finding that reliance on automation erodes attention to the cases it passes (Parasuraman and Manzey 2010). Two remedies follow from Proposition 8: rewards or flat pay that do not depend on how often errors occur, and gates that raise the prevalence of errors in the cases people see. The second is the structure of the gate-and-review systems described in Section 2.6.</w:t>
+        <w:t xml:space="preserve">The extension of Section 3.8 shows that the assumption of full detection is not innocuous. When detection depends on reviewers whose attention is private, screening and vigilance are substitutes in effect: the layers that remove errors also make errors rarer among the items a person inspects, and a reviewer who is paid per error found has less reason to look hard. In the illustration of Table E4, a three-layer cascade removes about 95% of the surviving errors but the number of incidents handled falls by more than 99%, because attention falls from complete to about one in eight. The firm that watches handled incidents, or plans to maintain the status quo while the dashboard improves, mistakes lost detection for success. This is moral hazard in the textbook sense, with an unobservable action and an outcome that is only partly informative about it (Holmström 1979), and it matches the human-factors finding that reliance on automation erodes attention to the cases it passes (Parasuraman and Manzey 2010). Two remedies follow from Proposition 8: rewards or flat pay that do not depend on how often errors occur, and gates that raise the prevalence of errors in the cases people see. The second is the logic of the pre-generation gating described in Section 2.6.</w:t>
       </w:r>
     </w:p>
     <w:p>
@@ -23466,20 +23466,6 @@
           <w:sz w:val="22"/>
           <w:szCs w:val="22"/>
         </w:rPr>
-        <w:t xml:space="preserve">PatSnap. n.d. "How to Evaluate Hallucination Rate in Large Language Models for High-Stakes Engineering Decision Support" (https://www.patsnap.com/resources/blog/articles/llm-hallucination-rate-evaluation-for-engineering/; accessed October 6, 2026).</w:t>
-      </w:r>
-    </w:p>
-    <w:p>
-      <w:pPr>
-        <w:spacing w:after="100" w:line="276"/>
-        <w:ind w:left="720" w:hanging="720"/>
-      </w:pPr>
-      <w:r>
-        <w:rPr>
-          <w:rFonts w:ascii="Times New Roman" w:cs="Times New Roman" w:eastAsia="Times New Roman" w:hAnsi="Times New Roman"/>
-          <w:sz w:val="22"/>
-          <w:szCs w:val="22"/>
-        </w:rPr>
         <w:t xml:space="preserve">Porteus, E. L. 2002. Foundations of Stochastic Inventory Theory. Stanford, CA: Stanford University Press.</w:t>
       </w:r>
     </w:p>
@@ -23606,7 +23592,7 @@
           <w:sz w:val="22"/>
           <w:szCs w:val="22"/>
         </w:rPr>
-        <w:t xml:space="preserve">Watson, W., Cho, N., and Srishankar, N. 2024. "Is There No Such Thing as a Bad Question? H4R: HalluciBot for Ratiocination, Rewriting, Ranking, and Routing," arXiv:2404.12535.</w:t>
+        <w:t xml:space="preserve">Watson, W., Cho, N., and Srishankar, N. 2024. "Is There No Such Thing as a Bad Question? H4R: HalluciBot for Ratiocination, Rewriting, Ranking, and Routing," Proceedings of AAAI 2025 (39:24) (arXiv:2404.12535).</w:t>
       </w:r>
     </w:p>
     <w:p>

</xml_diff>